<commit_message>
Update standard template and grouped placeholder form
</commit_message>
<xml_diff>
--- a/mau_bieu.docx
+++ b/mau_bieu.docx
@@ -18,8 +18,8 @@
         <w:tblLook w:val="04A0" w:firstRow="1" w:lastRow="0" w:firstColumn="1" w:lastColumn="0" w:noHBand="0" w:noVBand="1"/>
       </w:tblPr>
       <w:tblGrid>
-        <w:gridCol w:w="5460"/>
-        <w:gridCol w:w="5340"/>
+        <w:gridCol w:w="5433"/>
+        <w:gridCol w:w="5174"/>
       </w:tblGrid>
       <w:tr>
         <w:tc>
@@ -1520,31 +1520,13 @@
                 <w:rFonts w:ascii="Times New Roman" w:hAnsi="Times New Roman" w:cs="Times New Roman"/>
               </w:rPr>
             </w:pPr>
-            <w:sdt>
-              <w:sdtPr>
-                <w:rPr>
-                  <w:rFonts w:ascii="Times New Roman" w:hAnsi="Times New Roman"/>
-                  <w:lang w:val="de-DE"/>
-                </w:rPr>
-                <w:alias w:val="HD"/>
-                <w:tag w:val="HD"/>
-                <w:id w:val="397716365"/>
-                <w14:checkbox>
-                  <w14:checked w14:val="1"/>
-                  <w14:checkedState w14:val="0052" w14:font="Wingdings 2"/>
-                  <w14:uncheckedState w14:val="2610" w14:font="MS Gothic"/>
-                </w14:checkbox>
-              </w:sdtPr>
-              <w:sdtContent>
-                <w:r>
-                  <w:rPr>
-                    <w:rFonts w:ascii="Times New Roman" w:hAnsi="Times New Roman"/>
-                    <w:lang w:val="de-DE"/>
-                  </w:rPr>
-                  <w:sym w:font="Wingdings 2" w:char="F052"/>
-                </w:r>
-              </w:sdtContent>
-            </w:sdt>
+            <w:r>
+              <w:rPr>
+                <w:rFonts w:ascii="Times New Roman" w:hAnsi="Times New Roman"/>
+                <w:lang w:val="de-DE"/>
+              </w:rPr>
+              <w:sym w:font="Wingdings" w:char="F0A8"/>
+            </w:r>
             <w:r>
               <w:rPr>
                 <w:rFonts w:ascii="Times New Roman" w:hAnsi="Times New Roman" w:cs="Times New Roman"/>
@@ -1557,42 +1539,30 @@
               </w:rPr>
               <w:t xml:space="preserve">Công ty hợp danh/Hợp tác xã    </w:t>
             </w:r>
-            <w:sdt>
-              <w:sdtPr>
-                <w:rPr>
-                  <w:rFonts w:ascii="Times New Roman" w:hAnsi="Times New Roman"/>
-                  <w:lang w:val="de-DE"/>
-                </w:rPr>
-                <w:alias w:val="KHC"/>
-                <w:tag w:val="KHC"/>
-                <w:id w:val="-175659675"/>
-                <w14:checkbox>
-                  <w14:checked w14:val="0"/>
-                  <w14:checkedState w14:val="0052" w14:font="Wingdings 2"/>
-                  <w14:uncheckedState w14:val="2610" w14:font="MS Gothic"/>
-                </w14:checkbox>
-              </w:sdtPr>
-              <w:sdtContent>
-                <w:r>
-                  <w:rPr>
-                    <w:rFonts w:ascii="MS Gothic" w:eastAsia="MS Gothic" w:hAnsi="MS Gothic" w:hint="eastAsia"/>
-                    <w:lang w:val="de-DE"/>
-                  </w:rPr>
-                  <w:t>☐</w:t>
-                </w:r>
-              </w:sdtContent>
-            </w:sdt>
-            <w:r>
-              <w:rPr>
-                <w:rFonts w:ascii="Times New Roman" w:hAnsi="Times New Roman" w:cs="Times New Roman"/>
-              </w:rPr>
-              <w:t xml:space="preserve"> </w:t>
-            </w:r>
-            <w:r>
-              <w:rPr>
-                <w:rFonts w:ascii="Times New Roman" w:hAnsi="Times New Roman" w:cs="Times New Roman"/>
-              </w:rPr>
-              <w:t>Khác: ………………………..</w:t>
+            <w:r>
+              <w:rPr>
+                <w:rFonts w:ascii="Times New Roman" w:hAnsi="Times New Roman"/>
+                <w:lang w:val="de-DE"/>
+              </w:rPr>
+              <w:sym w:font="Wingdings 2" w:char="F052"/>
+            </w:r>
+            <w:r>
+              <w:rPr>
+                <w:rFonts w:ascii="Times New Roman" w:hAnsi="Times New Roman" w:cs="Times New Roman"/>
+              </w:rPr>
+              <w:t xml:space="preserve"> </w:t>
+            </w:r>
+            <w:r>
+              <w:rPr>
+                <w:rFonts w:ascii="Times New Roman" w:hAnsi="Times New Roman" w:cs="Times New Roman"/>
+              </w:rPr>
+              <w:t xml:space="preserve">Khác: </w:t>
+            </w:r>
+            <w:r>
+              <w:rPr>
+                <w:rFonts w:ascii="Times New Roman" w:hAnsi="Times New Roman" w:cs="Times New Roman"/>
+              </w:rPr>
+              <w:t>Hộ kinh doanh.</w:t>
             </w:r>
           </w:p>
           <w:p>
@@ -1711,7 +1681,31 @@
               <w:rPr>
                 <w:rFonts w:ascii="Times New Roman" w:hAnsi="Times New Roman" w:cs="Times New Roman"/>
               </w:rPr>
-              <w:t>Ngành nghề KD chính:……………….…..……….Sản phẩm chính:………..…………</w:t>
+              <w:t>Ngành nghề KD chính:</w:t>
+            </w:r>
+            <w:r>
+              <w:rPr>
+                <w:rFonts w:ascii="Times New Roman" w:hAnsi="Times New Roman" w:cs="Times New Roman"/>
+              </w:rPr>
+              <w:t xml:space="preserve"> </w:t>
+            </w:r>
+            <w:r>
+              <w:rPr>
+                <w:rFonts w:ascii="Times New Roman" w:hAnsi="Times New Roman" w:cs="Times New Roman"/>
+              </w:rPr>
+              <w:t>[Lv.KD]</w:t>
+            </w:r>
+            <w:r>
+              <w:rPr>
+                <w:rFonts w:ascii="Times New Roman" w:hAnsi="Times New Roman" w:cs="Times New Roman"/>
+              </w:rPr>
+              <w:t xml:space="preserve">. </w:t>
+            </w:r>
+            <w:r>
+              <w:rPr>
+                <w:rFonts w:ascii="Times New Roman" w:hAnsi="Times New Roman" w:cs="Times New Roman"/>
+              </w:rPr>
+              <w:t>Sản phẩm chính:………</w:t>
             </w:r>
             <w:r>
               <w:rPr>
@@ -1767,34 +1761,12 @@
               </w:rPr>
               <w:t xml:space="preserve">Vốn điều lệ:…………………….Phạm vi kinh doanh: </w:t>
             </w:r>
-            <w:sdt>
-              <w:sdtPr>
-                <w:rPr>
-                  <w:rFonts w:ascii="Times New Roman" w:hAnsi="Times New Roman"/>
-                  <w:lang w:val="de-DE"/>
-                </w:rPr>
-                <w:id w:val="-1220589295"/>
-                <w14:checkbox>
-                  <w14:checked w14:val="0"/>
-                  <w14:checkedState w14:val="0052" w14:font="Wingdings 2"/>
-                  <w14:uncheckedState w14:val="2610" w14:font="MS Gothic"/>
-                </w14:checkbox>
-              </w:sdtPr>
-              <w:sdtContent>
-                <w:r>
-                  <w:rPr>
-                    <w:rFonts w:ascii="MS Gothic" w:eastAsia="MS Gothic" w:hAnsi="MS Gothic" w:hint="eastAsia"/>
-                    <w:lang w:val="de-DE"/>
-                  </w:rPr>
-                  <w:t>☐</w:t>
-                </w:r>
-              </w:sdtContent>
-            </w:sdt>
-            <w:r>
-              <w:rPr>
-                <w:rFonts w:ascii="Times New Roman" w:hAnsi="Times New Roman" w:cs="Times New Roman"/>
-              </w:rPr>
-              <w:t xml:space="preserve"> </w:t>
+            <w:r>
+              <w:rPr>
+                <w:rFonts w:ascii="MS Gothic" w:eastAsia="MS Gothic" w:hAnsi="MS Gothic" w:hint="eastAsia"/>
+                <w:lang w:val="de-DE"/>
+              </w:rPr>
+              <w:sym w:font="Wingdings" w:char="F0FE"/>
             </w:r>
             <w:r>
               <w:rPr>
@@ -1925,32 +1897,17 @@
               </w:rPr>
               <w:t xml:space="preserve">Có  </w:t>
             </w:r>
-            <w:sdt>
-              <w:sdtPr>
-                <w:rPr>
-                  <w:rFonts w:ascii="Times New Roman" w:hAnsi="Times New Roman"/>
-                  <w:lang w:val="de-DE"/>
-                </w:rPr>
-                <w:id w:val="1714313451"/>
-                <w14:checkbox>
-                  <w14:checked w14:val="0"/>
-                  <w14:checkedState w14:val="0052" w14:font="Wingdings 2"/>
-                  <w14:uncheckedState w14:val="2610" w14:font="MS Gothic"/>
-                </w14:checkbox>
-              </w:sdtPr>
-              <w:sdtContent>
-                <w:r>
-                  <w:rPr>
-                    <w:rFonts w:ascii="MS Gothic" w:eastAsia="MS Gothic" w:hAnsi="MS Gothic" w:hint="eastAsia"/>
-                    <w:lang w:val="de-DE"/>
-                  </w:rPr>
-                  <w:t>☐</w:t>
-                </w:r>
-              </w:sdtContent>
-            </w:sdt>
-            <w:r>
-              <w:rPr>
-                <w:rFonts w:ascii="Times New Roman" w:hAnsi="Times New Roman" w:cs="Times New Roman"/>
+            <w:r>
+              <w:rPr>
+                <w:rFonts w:ascii="MS Gothic" w:eastAsia="MS Gothic" w:hAnsi="MS Gothic" w:hint="eastAsia"/>
+                <w:lang w:val="de-DE"/>
+              </w:rPr>
+              <w:sym w:font="Wingdings" w:char="F0FE"/>
+            </w:r>
+            <w:r>
+              <w:rPr>
+                <w:rFonts w:ascii="MS Gothic" w:eastAsia="MS Gothic" w:hAnsi="MS Gothic"/>
+                <w:lang w:val="de-DE"/>
               </w:rPr>
               <w:t xml:space="preserve"> </w:t>
             </w:r>
@@ -1965,7 +1922,7 @@
               <w:rPr>
                 <w:rFonts w:ascii="Times New Roman" w:hAnsi="Times New Roman" w:cs="Times New Roman"/>
               </w:rPr>
-              <w:t>Đại diện:……………….……Cơ quan chủ quản:………..…………………</w:t>
+              <w:t>Đại diện:……………….……Cơ quan chủ quản:………..……………</w:t>
             </w:r>
           </w:p>
         </w:tc>
@@ -2507,7 +2464,7 @@
       </w:tr>
       <w:tr>
         <w:trPr>
-          <w:trHeight w:val="609"/>
+          <w:trHeight w:val="737"/>
           <w:jc w:val="center"/>
         </w:trPr>
         <w:tc>
@@ -2531,6 +2488,27 @@
                 <w:szCs w:val="20"/>
               </w:rPr>
             </w:pPr>
+            <w:r>
+              <w:rPr>
+                <w:rFonts w:ascii="Times New Roman" w:hAnsi="Times New Roman"/>
+                <w:sz w:val="20"/>
+                <w:szCs w:val="20"/>
+              </w:rPr>
+              <w:t>1</w:t>
+            </w:r>
+          </w:p>
+          <w:p>
+            <w:pPr>
+              <w:rPr>
+                <w:rFonts w:ascii="Times New Roman" w:hAnsi="Times New Roman" w:cs="Times New Roman"/>
+              </w:rPr>
+            </w:pPr>
+            <w:r>
+              <w:rPr>
+                <w:rFonts w:ascii="Times New Roman" w:hAnsi="Times New Roman" w:cs="Times New Roman"/>
+              </w:rPr>
+              <w:t>1</w:t>
+            </w:r>
           </w:p>
         </w:tc>
         <w:tc>
@@ -2561,394 +2539,7 @@
                 <w:sz w:val="20"/>
                 <w:szCs w:val="20"/>
               </w:rPr>
-              <w:t>Chủ tị</w:t>
-            </w:r>
-            <w:r>
-              <w:rPr>
-                <w:rFonts w:ascii="Times New Roman" w:hAnsi="Times New Roman"/>
-                <w:sz w:val="20"/>
-                <w:szCs w:val="20"/>
-              </w:rPr>
-              <w:t>ch HĐQT /HĐTV</w:t>
-            </w:r>
-          </w:p>
-        </w:tc>
-        <w:tc>
-          <w:tcPr>
-            <w:tcW w:w="850" w:type="dxa"/>
-            <w:tcBorders>
-              <w:top w:val="single" w:sz="4" w:space="0" w:color="auto"/>
-              <w:left w:val="single" w:sz="4" w:space="0" w:color="auto"/>
-              <w:bottom w:val="single" w:sz="4" w:space="0" w:color="auto"/>
-              <w:right w:val="single" w:sz="4" w:space="0" w:color="auto"/>
-            </w:tcBorders>
-            <w:vAlign w:val="center"/>
-          </w:tcPr>
-          <w:p>
-            <w:pPr>
-              <w:pStyle w:val="NoSpacing"/>
-              <w:spacing w:before="0" w:beforeAutospacing="0" w:after="0" w:afterAutospacing="0"/>
-              <w:jc w:val="center"/>
-              <w:rPr>
-                <w:rFonts w:ascii="Times New Roman" w:hAnsi="Times New Roman"/>
-                <w:sz w:val="20"/>
-                <w:szCs w:val="20"/>
-              </w:rPr>
-            </w:pPr>
-            <w:r>
-              <w:rPr>
-                <w:rFonts w:ascii="Times New Roman" w:hAnsi="Times New Roman"/>
-                <w:sz w:val="20"/>
-                <w:szCs w:val="20"/>
-              </w:rPr>
-              <w:t>[HoTen.CT]</w:t>
-            </w:r>
-          </w:p>
-        </w:tc>
-        <w:tc>
-          <w:tcPr>
-            <w:tcW w:w="713" w:type="dxa"/>
-            <w:tcBorders>
-              <w:top w:val="single" w:sz="4" w:space="0" w:color="auto"/>
-              <w:left w:val="single" w:sz="4" w:space="0" w:color="auto"/>
-              <w:bottom w:val="single" w:sz="4" w:space="0" w:color="auto"/>
-              <w:right w:val="single" w:sz="4" w:space="0" w:color="auto"/>
-            </w:tcBorders>
-            <w:vAlign w:val="center"/>
-          </w:tcPr>
-          <w:p>
-            <w:pPr>
-              <w:pStyle w:val="NoSpacing"/>
-              <w:spacing w:before="0" w:beforeAutospacing="0" w:after="0" w:afterAutospacing="0"/>
-              <w:jc w:val="center"/>
-              <w:rPr>
-                <w:rFonts w:ascii="Times New Roman" w:hAnsi="Times New Roman"/>
-                <w:sz w:val="20"/>
-                <w:szCs w:val="20"/>
-              </w:rPr>
-            </w:pPr>
-            <w:r>
-              <w:rPr>
-                <w:rFonts w:ascii="Times New Roman" w:hAnsi="Times New Roman"/>
-                <w:sz w:val="20"/>
-                <w:szCs w:val="20"/>
-              </w:rPr>
-              <w:t>[GT.CT]</w:t>
-            </w:r>
-          </w:p>
-        </w:tc>
-        <w:tc>
-          <w:tcPr>
-            <w:tcW w:w="810" w:type="dxa"/>
-            <w:tcBorders>
-              <w:top w:val="single" w:sz="4" w:space="0" w:color="auto"/>
-              <w:left w:val="single" w:sz="4" w:space="0" w:color="auto"/>
-              <w:bottom w:val="single" w:sz="4" w:space="0" w:color="auto"/>
-              <w:right w:val="single" w:sz="4" w:space="0" w:color="auto"/>
-            </w:tcBorders>
-            <w:vAlign w:val="center"/>
-          </w:tcPr>
-          <w:p>
-            <w:pPr>
-              <w:pStyle w:val="NoSpacing"/>
-              <w:spacing w:before="0" w:beforeAutospacing="0" w:after="0" w:afterAutospacing="0"/>
-              <w:jc w:val="center"/>
-              <w:rPr>
-                <w:rFonts w:ascii="Times New Roman" w:hAnsi="Times New Roman"/>
-                <w:sz w:val="20"/>
-                <w:szCs w:val="20"/>
-              </w:rPr>
-            </w:pPr>
-            <w:r>
-              <w:rPr>
-                <w:rFonts w:ascii="Times New Roman" w:hAnsi="Times New Roman"/>
-                <w:sz w:val="20"/>
-                <w:szCs w:val="20"/>
-              </w:rPr>
-              <w:t>[NgS.CT]</w:t>
-            </w:r>
-          </w:p>
-        </w:tc>
-        <w:tc>
-          <w:tcPr>
-            <w:tcW w:w="810" w:type="dxa"/>
-            <w:tcBorders>
-              <w:top w:val="single" w:sz="4" w:space="0" w:color="auto"/>
-              <w:left w:val="single" w:sz="4" w:space="0" w:color="auto"/>
-              <w:bottom w:val="single" w:sz="4" w:space="0" w:color="auto"/>
-              <w:right w:val="single" w:sz="4" w:space="0" w:color="auto"/>
-            </w:tcBorders>
-            <w:vAlign w:val="center"/>
-          </w:tcPr>
-          <w:p>
-            <w:pPr>
-              <w:pStyle w:val="NoSpacing"/>
-              <w:spacing w:before="0" w:beforeAutospacing="0" w:after="0" w:afterAutospacing="0"/>
-              <w:jc w:val="center"/>
-              <w:rPr>
-                <w:rFonts w:ascii="Times New Roman" w:hAnsi="Times New Roman"/>
-                <w:sz w:val="20"/>
-                <w:szCs w:val="20"/>
-              </w:rPr>
-            </w:pPr>
-            <w:r>
-              <w:rPr>
-                <w:rFonts w:ascii="Times New Roman" w:hAnsi="Times New Roman"/>
-                <w:sz w:val="20"/>
-                <w:szCs w:val="20"/>
-              </w:rPr>
-              <w:t>[QT.CT]</w:t>
-            </w:r>
-          </w:p>
-        </w:tc>
-        <w:tc>
-          <w:tcPr>
-            <w:tcW w:w="1350" w:type="dxa"/>
-            <w:tcBorders>
-              <w:top w:val="single" w:sz="4" w:space="0" w:color="auto"/>
-              <w:left w:val="single" w:sz="4" w:space="0" w:color="auto"/>
-              <w:bottom w:val="single" w:sz="4" w:space="0" w:color="auto"/>
-              <w:right w:val="single" w:sz="4" w:space="0" w:color="auto"/>
-            </w:tcBorders>
-            <w:vAlign w:val="center"/>
-          </w:tcPr>
-          <w:p>
-            <w:pPr>
-              <w:pStyle w:val="NoSpacing"/>
-              <w:spacing w:before="0" w:beforeAutospacing="0" w:after="0" w:afterAutospacing="0"/>
-              <w:jc w:val="center"/>
-              <w:rPr>
-                <w:rFonts w:ascii="Times New Roman" w:hAnsi="Times New Roman"/>
-                <w:sz w:val="20"/>
-                <w:szCs w:val="20"/>
-              </w:rPr>
-            </w:pPr>
-            <w:r>
-              <w:rPr>
-                <w:rFonts w:ascii="Times New Roman" w:hAnsi="Times New Roman"/>
-                <w:sz w:val="20"/>
-                <w:szCs w:val="20"/>
-              </w:rPr>
-              <w:t>[SoCC]</w:t>
-            </w:r>
-            <w:r>
-              <w:rPr>
-                <w:rFonts w:ascii="Times New Roman" w:hAnsi="Times New Roman"/>
-                <w:sz w:val="20"/>
-                <w:szCs w:val="20"/>
-              </w:rPr>
-              <w:t xml:space="preserve"> - </w:t>
-            </w:r>
-            <w:r>
-              <w:t xml:space="preserve"> </w:t>
-            </w:r>
-            <w:r>
-              <w:rPr>
-                <w:rFonts w:ascii="Times New Roman" w:hAnsi="Times New Roman"/>
-                <w:sz w:val="20"/>
-                <w:szCs w:val="20"/>
-              </w:rPr>
-              <w:t>[NgC.CT]</w:t>
-            </w:r>
-            <w:r>
-              <w:rPr>
-                <w:rFonts w:ascii="Times New Roman" w:hAnsi="Times New Roman"/>
-                <w:sz w:val="20"/>
-                <w:szCs w:val="20"/>
-              </w:rPr>
-              <w:t xml:space="preserve"> - </w:t>
-            </w:r>
-            <w:r>
-              <w:t xml:space="preserve"> </w:t>
-            </w:r>
-            <w:r>
-              <w:rPr>
-                <w:rFonts w:ascii="Times New Roman" w:hAnsi="Times New Roman"/>
-                <w:sz w:val="20"/>
-                <w:szCs w:val="20"/>
-              </w:rPr>
-              <w:t>[NC.CT]</w:t>
-            </w:r>
-          </w:p>
-        </w:tc>
-        <w:tc>
-          <w:tcPr>
-            <w:tcW w:w="990" w:type="dxa"/>
-            <w:tcBorders>
-              <w:top w:val="single" w:sz="4" w:space="0" w:color="auto"/>
-              <w:left w:val="single" w:sz="4" w:space="0" w:color="auto"/>
-              <w:bottom w:val="single" w:sz="4" w:space="0" w:color="auto"/>
-              <w:right w:val="single" w:sz="4" w:space="0" w:color="auto"/>
-            </w:tcBorders>
-            <w:vAlign w:val="center"/>
-          </w:tcPr>
-          <w:p>
-            <w:pPr>
-              <w:pStyle w:val="NoSpacing"/>
-              <w:spacing w:before="0" w:beforeAutospacing="0" w:after="0" w:afterAutospacing="0"/>
-              <w:jc w:val="center"/>
-              <w:rPr>
-                <w:rFonts w:ascii="Times New Roman" w:hAnsi="Times New Roman"/>
-                <w:sz w:val="20"/>
-                <w:szCs w:val="20"/>
-              </w:rPr>
-            </w:pPr>
-            <w:r>
-              <w:rPr>
-                <w:rFonts w:ascii="Times New Roman" w:hAnsi="Times New Roman"/>
-                <w:sz w:val="20"/>
-                <w:szCs w:val="20"/>
-              </w:rPr>
-              <w:t>[DC.CT]</w:t>
-            </w:r>
-          </w:p>
-        </w:tc>
-        <w:tc>
-          <w:tcPr>
-            <w:tcW w:w="1139" w:type="dxa"/>
-            <w:tcBorders>
-              <w:top w:val="single" w:sz="4" w:space="0" w:color="auto"/>
-              <w:left w:val="single" w:sz="4" w:space="0" w:color="auto"/>
-              <w:bottom w:val="single" w:sz="4" w:space="0" w:color="auto"/>
-              <w:right w:val="single" w:sz="4" w:space="0" w:color="auto"/>
-            </w:tcBorders>
-            <w:vAlign w:val="center"/>
-          </w:tcPr>
-          <w:p>
-            <w:pPr>
-              <w:pStyle w:val="NoSpacing"/>
-              <w:spacing w:before="0" w:beforeAutospacing="0" w:after="0" w:afterAutospacing="0"/>
-              <w:jc w:val="center"/>
-              <w:rPr>
-                <w:rFonts w:ascii="Times New Roman" w:hAnsi="Times New Roman"/>
-                <w:sz w:val="20"/>
-                <w:szCs w:val="20"/>
-              </w:rPr>
-            </w:pPr>
-            <w:r>
-              <w:rPr>
-                <w:rFonts w:ascii="Times New Roman" w:hAnsi="Times New Roman"/>
-                <w:sz w:val="20"/>
-                <w:szCs w:val="20"/>
-              </w:rPr>
-              <w:t>[DC.CT]</w:t>
-            </w:r>
-          </w:p>
-        </w:tc>
-        <w:tc>
-          <w:tcPr>
-            <w:tcW w:w="992" w:type="dxa"/>
-            <w:tcBorders>
-              <w:top w:val="single" w:sz="4" w:space="0" w:color="auto"/>
-              <w:left w:val="single" w:sz="4" w:space="0" w:color="auto"/>
-              <w:bottom w:val="single" w:sz="4" w:space="0" w:color="auto"/>
-              <w:right w:val="single" w:sz="4" w:space="0" w:color="auto"/>
-            </w:tcBorders>
-            <w:vAlign w:val="center"/>
-          </w:tcPr>
-          <w:p>
-            <w:pPr>
-              <w:pStyle w:val="NoSpacing"/>
-              <w:spacing w:before="0" w:beforeAutospacing="0" w:after="0" w:afterAutospacing="0"/>
-              <w:jc w:val="center"/>
-              <w:rPr>
-                <w:rFonts w:ascii="Times New Roman" w:hAnsi="Times New Roman"/>
-                <w:sz w:val="20"/>
-                <w:szCs w:val="20"/>
-              </w:rPr>
-            </w:pPr>
-          </w:p>
-        </w:tc>
-        <w:tc>
-          <w:tcPr>
-            <w:tcW w:w="851" w:type="dxa"/>
-            <w:tcBorders>
-              <w:top w:val="single" w:sz="4" w:space="0" w:color="auto"/>
-              <w:left w:val="single" w:sz="4" w:space="0" w:color="auto"/>
-              <w:bottom w:val="single" w:sz="4" w:space="0" w:color="auto"/>
-              <w:right w:val="single" w:sz="4" w:space="0" w:color="auto"/>
-            </w:tcBorders>
-            <w:vAlign w:val="center"/>
-          </w:tcPr>
-          <w:p>
-            <w:pPr>
-              <w:pStyle w:val="NoSpacing"/>
-              <w:spacing w:before="0" w:beforeAutospacing="0" w:after="0" w:afterAutospacing="0"/>
-              <w:jc w:val="center"/>
-              <w:rPr>
-                <w:rFonts w:ascii="Times New Roman" w:hAnsi="Times New Roman"/>
-                <w:sz w:val="20"/>
-                <w:szCs w:val="20"/>
-              </w:rPr>
-            </w:pPr>
-            <w:r>
-              <w:rPr>
-                <w:rFonts w:ascii="Times New Roman" w:hAnsi="Times New Roman"/>
-                <w:sz w:val="20"/>
-                <w:szCs w:val="20"/>
-              </w:rPr>
-              <w:t>[SoDT.CT]</w:t>
-            </w:r>
-          </w:p>
-        </w:tc>
-      </w:tr>
-      <w:tr>
-        <w:trPr>
-          <w:trHeight w:val="737"/>
-          <w:jc w:val="center"/>
-        </w:trPr>
-        <w:tc>
-          <w:tcPr>
-            <w:tcW w:w="534" w:type="dxa"/>
-            <w:tcBorders>
-              <w:top w:val="single" w:sz="4" w:space="0" w:color="auto"/>
-              <w:left w:val="single" w:sz="4" w:space="0" w:color="auto"/>
-              <w:bottom w:val="single" w:sz="4" w:space="0" w:color="auto"/>
-              <w:right w:val="single" w:sz="4" w:space="0" w:color="auto"/>
-            </w:tcBorders>
-          </w:tcPr>
-          <w:p>
-            <w:pPr>
-              <w:pStyle w:val="NoSpacing"/>
-              <w:spacing w:before="0" w:beforeAutospacing="0" w:after="0" w:afterAutospacing="0"/>
-              <w:ind w:hanging="284"/>
-              <w:rPr>
-                <w:rFonts w:ascii="Times New Roman" w:hAnsi="Times New Roman"/>
-                <w:sz w:val="20"/>
-                <w:szCs w:val="20"/>
-              </w:rPr>
-            </w:pPr>
-          </w:p>
-        </w:tc>
-        <w:tc>
-          <w:tcPr>
-            <w:tcW w:w="1701" w:type="dxa"/>
-            <w:tcBorders>
-              <w:top w:val="single" w:sz="4" w:space="0" w:color="auto"/>
-              <w:left w:val="single" w:sz="4" w:space="0" w:color="auto"/>
-              <w:bottom w:val="single" w:sz="4" w:space="0" w:color="auto"/>
-              <w:right w:val="single" w:sz="4" w:space="0" w:color="auto"/>
-            </w:tcBorders>
-            <w:vAlign w:val="center"/>
-            <w:hideMark/>
-          </w:tcPr>
-          <w:p>
-            <w:pPr>
-              <w:pStyle w:val="NoSpacing"/>
-              <w:spacing w:before="0" w:beforeAutospacing="0" w:after="0" w:afterAutospacing="0"/>
-              <w:rPr>
-                <w:rFonts w:ascii="Times New Roman" w:hAnsi="Times New Roman"/>
-                <w:sz w:val="20"/>
-                <w:szCs w:val="20"/>
-              </w:rPr>
-            </w:pPr>
-            <w:r>
-              <w:rPr>
-                <w:rFonts w:ascii="Times New Roman" w:hAnsi="Times New Roman"/>
-                <w:sz w:val="20"/>
-                <w:szCs w:val="20"/>
-              </w:rPr>
-              <w:t>Tổng giám đốc/ Giám đốc</w:t>
+              <w:t>Chủ hộ kinh doanh</w:t>
             </w:r>
           </w:p>
         </w:tc>
@@ -4100,6 +3691,7 @@
           <w:rFonts w:ascii="Times New Roman" w:hAnsi="Times New Roman" w:cs="Times New Roman"/>
           <w:b/>
         </w:rPr>
+        <w:lastRenderedPageBreak/>
         <w:t xml:space="preserve">Thông tin về đại diện góp vốn tại pháp nhân khác </w:t>
       </w:r>
     </w:p>
@@ -4662,7 +4254,7 @@
                 <w:sz w:val="20"/>
                 <w:szCs w:val="20"/>
               </w:rPr>
-              <w:t>[HoTen.</w:t>
+              <w:t>[HoTen.GD]</w:t>
             </w:r>
             <w:r>
               <w:rPr>
@@ -4670,7 +4262,19 @@
                 <w:sz w:val="20"/>
                 <w:szCs w:val="20"/>
               </w:rPr>
-              <w:t>T</w:t>
+              <w:t xml:space="preserve">. </w:t>
+            </w:r>
+            <w:r>
+              <w:rPr>
+                <w:rFonts w:ascii="Times New Roman" w:hAnsi="Times New Roman" w:cs="Times New Roman"/>
+              </w:rPr>
+              <w:t>Ngày sinh</w:t>
+            </w:r>
+            <w:r>
+              <w:rPr>
+                <w:rFonts w:ascii="Times New Roman" w:hAnsi="Times New Roman" w:cs="Times New Roman"/>
+              </w:rPr>
+              <w:t xml:space="preserve">: </w:t>
             </w:r>
             <w:r>
               <w:rPr>
@@ -4678,45 +4282,7 @@
                 <w:sz w:val="20"/>
                 <w:szCs w:val="20"/>
               </w:rPr>
-              <w:t>L]</w:t>
-            </w:r>
-            <w:r>
-              <w:rPr>
-                <w:rFonts w:ascii="Times New Roman" w:hAnsi="Times New Roman"/>
-                <w:sz w:val="20"/>
-                <w:szCs w:val="20"/>
-              </w:rPr>
-              <w:t xml:space="preserve">. </w:t>
-            </w:r>
-            <w:r>
-              <w:rPr>
-                <w:rFonts w:ascii="Times New Roman" w:hAnsi="Times New Roman" w:cs="Times New Roman"/>
-              </w:rPr>
-              <w:t>Ngày sinh</w:t>
-            </w:r>
-            <w:r>
-              <w:rPr>
-                <w:rFonts w:ascii="Times New Roman" w:hAnsi="Times New Roman" w:cs="Times New Roman"/>
-              </w:rPr>
-              <w:t xml:space="preserve">: </w:t>
-            </w:r>
-            <w:r>
-              <w:rPr>
-                <w:rFonts w:ascii="Times New Roman" w:hAnsi="Times New Roman" w:cs="Times New Roman"/>
-              </w:rPr>
-              <w:t>[GT.</w:t>
-            </w:r>
-            <w:r>
-              <w:rPr>
-                <w:rFonts w:ascii="Times New Roman" w:hAnsi="Times New Roman" w:cs="Times New Roman"/>
-              </w:rPr>
-              <w:t>T</w:t>
-            </w:r>
-            <w:r>
-              <w:rPr>
-                <w:rFonts w:ascii="Times New Roman" w:hAnsi="Times New Roman" w:cs="Times New Roman"/>
-              </w:rPr>
-              <w:t>L]</w:t>
+              <w:t>[NgS.GD]</w:t>
             </w:r>
             <w:r>
               <w:rPr>
@@ -4842,7 +4408,7 @@
               <w:rPr>
                 <w:rFonts w:ascii="Times New Roman" w:hAnsi="Times New Roman" w:cs="Times New Roman"/>
               </w:rPr>
-              <w:t xml:space="preserve">[CV.TL] </w:t>
+              <w:t>Chủ hộ KD</w:t>
             </w:r>
             <w:r>
               <w:rPr>
@@ -4863,13 +4429,7 @@
               <w:rPr>
                 <w:rFonts w:ascii="Times New Roman" w:hAnsi="Times New Roman" w:cs="Times New Roman"/>
               </w:rPr>
-              <w:t>[CV.TL]</w:t>
-            </w:r>
-            <w:r>
-              <w:rPr>
-                <w:rFonts w:ascii="Times New Roman" w:hAnsi="Times New Roman" w:cs="Times New Roman"/>
-              </w:rPr>
-              <w:t>.</w:t>
+              <w:t>Chủ hộ KD.</w:t>
             </w:r>
             <w:r>
               <w:rPr>
@@ -4882,20 +4442,15 @@
               <w:rPr>
                 <w:rFonts w:ascii="Times New Roman" w:eastAsia="Arial Unicode MS" w:hAnsi="Times New Roman" w:cs="Times New Roman"/>
               </w:rPr>
-              <w:t>Mã số thuế cá nhân: ……………..……</w:t>
-            </w:r>
-            <w:r>
-              <w:rPr>
-                <w:rFonts w:ascii="Times New Roman" w:eastAsia="Arial Unicode MS" w:hAnsi="Times New Roman" w:cs="Times New Roman"/>
-              </w:rPr>
-              <w:t>..</w:t>
-            </w:r>
-            <w:r>
-              <w:rPr>
-                <w:rFonts w:ascii="Times New Roman" w:eastAsia="Arial Unicode MS" w:hAnsi="Times New Roman" w:cs="Times New Roman"/>
-                <w:i/>
-              </w:rPr>
-              <w:t xml:space="preserve">  </w:t>
+              <w:t xml:space="preserve">Mã số thuế cá nhân: </w:t>
+            </w:r>
+            <w:r>
+              <w:rPr>
+                <w:rFonts w:ascii="Times New Roman" w:hAnsi="Times New Roman"/>
+                <w:sz w:val="20"/>
+                <w:szCs w:val="20"/>
+              </w:rPr>
+              <w:t>[SoCC.GD]</w:t>
             </w:r>
           </w:p>
           <w:p>
@@ -4937,37 +4492,12 @@
                 <w:lang w:val="pt-BR"/>
               </w:rPr>
             </w:pPr>
-            <w:sdt>
-              <w:sdtPr>
-                <w:rPr>
-                  <w:rFonts w:ascii="Times New Roman" w:hAnsi="Times New Roman"/>
-                  <w:lang w:val="de-DE"/>
-                </w:rPr>
-                <w:alias w:val="QTVN.TL"/>
-                <w:tag w:val="QTVN.TL"/>
-                <w:id w:val="919065091"/>
-                <w14:checkbox>
-                  <w14:checked w14:val="1"/>
-                  <w14:checkedState w14:val="0052" w14:font="Wingdings 2"/>
-                  <w14:uncheckedState w14:val="2610" w14:font="MS Gothic"/>
-                </w14:checkbox>
-              </w:sdtPr>
-              <w:sdtContent>
-                <w:r>
-                  <w:rPr>
-                    <w:rFonts w:ascii="Times New Roman" w:hAnsi="Times New Roman"/>
-                    <w:lang w:val="de-DE"/>
-                  </w:rPr>
-                  <w:sym w:font="Wingdings 2" w:char="F052"/>
-                </w:r>
-              </w:sdtContent>
-            </w:sdt>
-            <w:r>
-              <w:rPr>
-                <w:rFonts w:ascii="Times New Roman" w:hAnsi="Times New Roman"/>
-                <w:lang w:val="pt-BR"/>
-              </w:rPr>
-              <w:t xml:space="preserve"> </w:t>
+            <w:r>
+              <w:rPr>
+                <w:rFonts w:ascii="Times New Roman" w:hAnsi="Times New Roman"/>
+                <w:lang w:val="de-DE"/>
+              </w:rPr>
+              <w:sym w:font="Wingdings" w:char="F0FE"/>
             </w:r>
             <w:r>
               <w:rPr>
@@ -4976,37 +4506,12 @@
               </w:rPr>
               <w:t xml:space="preserve">Quốc tịch Việt Nam; </w:t>
             </w:r>
-            <w:sdt>
-              <w:sdtPr>
-                <w:rPr>
-                  <w:rFonts w:ascii="Times New Roman" w:hAnsi="Times New Roman"/>
-                  <w:lang w:val="de-DE"/>
-                </w:rPr>
-                <w:alias w:val="QTK.TL"/>
-                <w:tag w:val="QTK.TL"/>
-                <w:id w:val="-542136949"/>
-                <w14:checkbox>
-                  <w14:checked w14:val="1"/>
-                  <w14:checkedState w14:val="0052" w14:font="Wingdings 2"/>
-                  <w14:uncheckedState w14:val="2610" w14:font="MS Gothic"/>
-                </w14:checkbox>
-              </w:sdtPr>
-              <w:sdtContent>
-                <w:r>
-                  <w:rPr>
-                    <w:rFonts w:ascii="Times New Roman" w:hAnsi="Times New Roman"/>
-                    <w:lang w:val="de-DE"/>
-                  </w:rPr>
-                  <w:sym w:font="Wingdings 2" w:char="F052"/>
-                </w:r>
-              </w:sdtContent>
-            </w:sdt>
-            <w:r>
-              <w:rPr>
-                <w:rFonts w:ascii="Times New Roman" w:hAnsi="Times New Roman"/>
-                <w:lang w:val="pt-BR"/>
-              </w:rPr>
-              <w:t xml:space="preserve"> </w:t>
+            <w:r>
+              <w:rPr>
+                <w:rFonts w:ascii="Times New Roman" w:hAnsi="Times New Roman"/>
+                <w:lang w:val="de-DE"/>
+              </w:rPr>
+              <w:sym w:font="Wingdings" w:char="F0A8"/>
             </w:r>
             <w:r>
               <w:rPr>
@@ -5036,29 +4541,13 @@
               </w:rPr>
               <w:t xml:space="preserve"> </w:t>
             </w:r>
-            <w:sdt>
-              <w:sdtPr>
-                <w:rPr>
-                  <w:rFonts w:ascii="Times New Roman" w:hAnsi="Times New Roman"/>
-                  <w:lang w:val="de-DE"/>
-                </w:rPr>
-                <w:id w:val="-1219046983"/>
-                <w14:checkbox>
-                  <w14:checked w14:val="0"/>
-                  <w14:checkedState w14:val="0052" w14:font="Wingdings 2"/>
-                  <w14:uncheckedState w14:val="2610" w14:font="MS Gothic"/>
-                </w14:checkbox>
-              </w:sdtPr>
-              <w:sdtContent>
-                <w:r>
-                  <w:rPr>
-                    <w:rFonts w:ascii="MS Gothic" w:eastAsia="MS Gothic" w:hAnsi="MS Gothic" w:hint="eastAsia"/>
-                    <w:lang w:val="de-DE"/>
-                  </w:rPr>
-                  <w:t>☐</w:t>
-                </w:r>
-              </w:sdtContent>
-            </w:sdt>
+            <w:r>
+              <w:rPr>
+                <w:rFonts w:ascii="Times New Roman" w:hAnsi="Times New Roman"/>
+                <w:lang w:val="de-DE"/>
+              </w:rPr>
+              <w:sym w:font="Wingdings" w:char="F0FE"/>
+            </w:r>
             <w:r>
               <w:rPr>
                 <w:rFonts w:ascii="Times New Roman" w:hAnsi="Times New Roman"/>
@@ -5358,21 +4847,31 @@
                 <w:rFonts w:ascii="Times New Roman" w:hAnsi="Times New Roman"/>
                 <w:lang w:val="pt-BR"/>
               </w:rPr>
-              <w:t>[SoCC.</w:t>
-            </w:r>
-            <w:r>
-              <w:rPr>
-                <w:rFonts w:ascii="Times New Roman" w:hAnsi="Times New Roman"/>
-                <w:lang w:val="pt-BR"/>
-              </w:rPr>
-              <w:t>T</w:t>
-            </w:r>
-            <w:r>
-              <w:rPr>
-                <w:rFonts w:ascii="Times New Roman" w:hAnsi="Times New Roman"/>
-                <w:lang w:val="pt-BR"/>
-              </w:rPr>
-              <w:t>L]</w:t>
+              <w:t>[SoCC.GD]</w:t>
+            </w:r>
+            <w:r>
+              <w:rPr>
+                <w:rFonts w:ascii="Times New Roman" w:hAnsi="Times New Roman"/>
+                <w:lang w:val="pt-BR"/>
+              </w:rPr>
+              <w:t xml:space="preserve">. </w:t>
+            </w:r>
+            <w:r>
+              <w:rPr>
+                <w:rFonts w:ascii="Times New Roman" w:hAnsi="Times New Roman"/>
+                <w:lang w:val="pt-BR"/>
+              </w:rPr>
+              <w:t xml:space="preserve">Ngày cấp: </w:t>
+            </w:r>
+            <w:r>
+              <w:t xml:space="preserve"> </w:t>
+            </w:r>
+            <w:r>
+              <w:rPr>
+                <w:rFonts w:ascii="Times New Roman" w:hAnsi="Times New Roman"/>
+                <w:lang w:val="pt-BR"/>
+              </w:rPr>
+              <w:t>[NgC.GD]</w:t>
             </w:r>
             <w:r>
               <w:rPr>
@@ -5386,31 +4885,21 @@
                 <w:rFonts w:ascii="Times New Roman" w:hAnsi="Times New Roman"/>
                 <w:lang w:val="pt-BR"/>
               </w:rPr>
-              <w:t xml:space="preserve"> Ngày cấp: </w:t>
-            </w:r>
-            <w:r>
-              <w:t xml:space="preserve"> </w:t>
-            </w:r>
-            <w:r>
-              <w:rPr>
-                <w:rFonts w:ascii="Times New Roman" w:hAnsi="Times New Roman"/>
-                <w:lang w:val="pt-BR"/>
-              </w:rPr>
-              <w:t>[NgC.</w:t>
-            </w:r>
-            <w:r>
-              <w:rPr>
-                <w:rFonts w:ascii="Times New Roman" w:hAnsi="Times New Roman"/>
-                <w:lang w:val="pt-BR"/>
-              </w:rPr>
-              <w:t>T</w:t>
-            </w:r>
-            <w:r>
-              <w:rPr>
-                <w:rFonts w:ascii="Times New Roman" w:hAnsi="Times New Roman"/>
-                <w:lang w:val="pt-BR"/>
-              </w:rPr>
-              <w:t>L]</w:t>
+              <w:t xml:space="preserve">  Nơi cấp:</w:t>
+            </w:r>
+            <w:r>
+              <w:rPr>
+                <w:rFonts w:ascii="Times New Roman" w:hAnsi="Times New Roman"/>
+                <w:lang w:val="pt-BR"/>
+              </w:rPr>
+              <w:t xml:space="preserve"> </w:t>
+            </w:r>
+            <w:r>
+              <w:rPr>
+                <w:rFonts w:ascii="Times New Roman" w:hAnsi="Times New Roman"/>
+                <w:lang w:val="pt-BR"/>
+              </w:rPr>
+              <w:t>[NC.GD]</w:t>
             </w:r>
             <w:r>
               <w:rPr>
@@ -5424,48 +4913,6 @@
                 <w:rFonts w:ascii="Times New Roman" w:hAnsi="Times New Roman"/>
                 <w:lang w:val="pt-BR"/>
               </w:rPr>
-              <w:t xml:space="preserve">  Nơi cấp:</w:t>
-            </w:r>
-            <w:r>
-              <w:rPr>
-                <w:rFonts w:ascii="Times New Roman" w:hAnsi="Times New Roman"/>
-                <w:lang w:val="pt-BR"/>
-              </w:rPr>
-              <w:t xml:space="preserve"> </w:t>
-            </w:r>
-            <w:r>
-              <w:rPr>
-                <w:rFonts w:ascii="Times New Roman" w:hAnsi="Times New Roman"/>
-                <w:lang w:val="pt-BR"/>
-              </w:rPr>
-              <w:t>[NC.</w:t>
-            </w:r>
-            <w:r>
-              <w:rPr>
-                <w:rFonts w:ascii="Times New Roman" w:hAnsi="Times New Roman"/>
-                <w:lang w:val="pt-BR"/>
-              </w:rPr>
-              <w:t>TL</w:t>
-            </w:r>
-            <w:r>
-              <w:rPr>
-                <w:rFonts w:ascii="Times New Roman" w:hAnsi="Times New Roman"/>
-                <w:lang w:val="pt-BR"/>
-              </w:rPr>
-              <w:t>]</w:t>
-            </w:r>
-            <w:r>
-              <w:rPr>
-                <w:rFonts w:ascii="Times New Roman" w:hAnsi="Times New Roman"/>
-                <w:lang w:val="pt-BR"/>
-              </w:rPr>
-              <w:t>.</w:t>
-            </w:r>
-            <w:r>
-              <w:rPr>
-                <w:rFonts w:ascii="Times New Roman" w:hAnsi="Times New Roman"/>
-                <w:lang w:val="pt-BR"/>
-              </w:rPr>
               <w:t xml:space="preserve"> </w:t>
             </w:r>
             <w:r>
@@ -5483,7 +4930,7 @@
                 <w:rFonts w:ascii="Times New Roman" w:hAnsi="Times New Roman"/>
                 <w:lang w:val="pt-BR"/>
               </w:rPr>
-              <w:t>[NgHH.TL]</w:t>
+              <w:t>[NgHH.GD]</w:t>
             </w:r>
           </w:p>
           <w:p>
@@ -5754,7 +5201,7 @@
                 <w:rFonts w:ascii="Times New Roman" w:hAnsi="Times New Roman"/>
                 <w:lang w:val="pt-BR"/>
               </w:rPr>
-              <w:t>[DC.TL]</w:t>
+              <w:t>[DC.GD]</w:t>
             </w:r>
           </w:p>
           <w:p>
@@ -5783,7 +5230,7 @@
                 <w:rFonts w:ascii="Times New Roman" w:hAnsi="Times New Roman"/>
                 <w:lang w:val="pt-BR"/>
               </w:rPr>
-              <w:t xml:space="preserve">[DC.TL] </w:t>
+              <w:t>[DC.GD]</w:t>
             </w:r>
             <w:r>
               <w:rPr>
@@ -5807,7 +5254,7 @@
                 <w:rFonts w:ascii="Times New Roman" w:hAnsi="Times New Roman"/>
                 <w:lang w:val="pt-BR"/>
               </w:rPr>
-              <w:t>[SoDT.TL]</w:t>
+              <w:t>[SoDT.GD]</w:t>
             </w:r>
           </w:p>
           <w:p>
@@ -7206,7 +6653,6 @@
                 <w:rFonts w:ascii="Times New Roman" w:hAnsi="Times New Roman"/>
                 <w:lang w:val="pt-BR"/>
               </w:rPr>
-              <w:lastRenderedPageBreak/>
               <w:t xml:space="preserve">Giấy tờ tùy thân: </w:t>
             </w:r>
             <w:r>
@@ -7334,6 +6780,7 @@
                 <w:rFonts w:ascii="Times New Roman" w:hAnsi="Times New Roman"/>
                 <w:lang w:val="pt-BR"/>
               </w:rPr>
+              <w:lastRenderedPageBreak/>
               <w:t>Số: .................................... Ngày cấp: .../…/........   Nơi cấp:……….……….  Ngày hết hạn HL: …/…/…</w:t>
             </w:r>
           </w:p>
@@ -8468,32 +7915,51 @@
             <w:r>
               <w:rPr>
                 <w:rFonts w:ascii="Times New Roman" w:hAnsi="Times New Roman"/>
-              </w:rPr>
-              <w:t xml:space="preserve">[HoTen.TL]. </w:t>
-            </w:r>
-            <w:r>
-              <w:rPr>
-                <w:rFonts w:ascii="Times New Roman" w:hAnsi="Times New Roman" w:cs="Times New Roman"/>
-              </w:rPr>
-              <w:t>Ngày sinh:</w:t>
-            </w:r>
-            <w:r>
-              <w:rPr>
-                <w:rFonts w:ascii="Times New Roman" w:hAnsi="Times New Roman" w:cs="Times New Roman"/>
-              </w:rPr>
-              <w:t xml:space="preserve"> [GT.TL].</w:t>
-            </w:r>
-            <w:r>
-              <w:rPr>
-                <w:rFonts w:ascii="Times New Roman" w:hAnsi="Times New Roman" w:cs="Times New Roman"/>
-              </w:rPr>
-              <w:t xml:space="preserve"> </w:t>
-            </w:r>
-            <w:r>
-              <w:rPr>
-                <w:rFonts w:ascii="Times New Roman" w:hAnsi="Times New Roman" w:cs="Times New Roman"/>
-              </w:rPr>
-              <w:t xml:space="preserve">Giới tính: </w:t>
+                <w:sz w:val="20"/>
+                <w:szCs w:val="20"/>
+              </w:rPr>
+              <w:t>[HoTen.GD]</w:t>
+            </w:r>
+            <w:r>
+              <w:rPr>
+                <w:rFonts w:ascii="Times New Roman" w:hAnsi="Times New Roman"/>
+                <w:sz w:val="20"/>
+                <w:szCs w:val="20"/>
+              </w:rPr>
+              <w:t xml:space="preserve">. </w:t>
+            </w:r>
+            <w:r>
+              <w:rPr>
+                <w:rFonts w:ascii="Times New Roman" w:hAnsi="Times New Roman" w:cs="Times New Roman"/>
+              </w:rPr>
+              <w:t>Ngày sinh</w:t>
+            </w:r>
+            <w:r>
+              <w:rPr>
+                <w:rFonts w:ascii="Times New Roman" w:hAnsi="Times New Roman" w:cs="Times New Roman"/>
+              </w:rPr>
+              <w:t xml:space="preserve">: </w:t>
+            </w:r>
+            <w:r>
+              <w:rPr>
+                <w:rFonts w:ascii="Times New Roman" w:hAnsi="Times New Roman"/>
+                <w:sz w:val="20"/>
+                <w:szCs w:val="20"/>
+              </w:rPr>
+              <w:t>[NgS.GD]</w:t>
+            </w:r>
+            <w:r>
+              <w:rPr>
+                <w:rFonts w:ascii="Times New Roman" w:hAnsi="Times New Roman" w:cs="Times New Roman"/>
+              </w:rPr>
+              <w:t xml:space="preserve">. Giới tính: </w:t>
+            </w:r>
+            <w:r>
+              <w:rPr>
+                <w:rFonts w:ascii="Times New Roman" w:hAnsi="Times New Roman"/>
+                <w:lang w:val="de-DE"/>
+              </w:rPr>
+              <w:t xml:space="preserve"> </w:t>
             </w:r>
             <w:sdt>
               <w:sdtPr>
@@ -8503,7 +7969,7 @@
                 </w:rPr>
                 <w:alias w:val="Nam.TL"/>
                 <w:tag w:val="Nam.TL"/>
-                <w:id w:val="492148724"/>
+                <w:id w:val="-115760099"/>
                 <w14:checkbox>
                   <w14:checked w14:val="0"/>
                   <w14:checkedState w14:val="0052" w14:font="Wingdings 2"/>
@@ -8547,7 +8013,7 @@
                 </w:rPr>
                 <w:alias w:val="Nu.TL"/>
                 <w:tag w:val="Nu.TL"/>
-                <w:id w:val="-627080845"/>
+                <w:id w:val="1317688996"/>
                 <w14:checkbox>
                   <w14:checked w14:val="0"/>
                   <w14:checkedState w14:val="0052" w14:font="Wingdings 2"/>
@@ -8594,40 +8060,34 @@
               <w:t>Nghề nghiệp:</w:t>
             </w:r>
             <w:r>
-              <w:rPr>
-                <w:rFonts w:ascii="Times New Roman" w:hAnsi="Times New Roman" w:cs="Times New Roman"/>
-              </w:rPr>
-              <w:t xml:space="preserve"> </w:t>
-            </w:r>
-            <w:r>
-              <w:rPr>
-                <w:rFonts w:ascii="Times New Roman" w:hAnsi="Times New Roman" w:cs="Times New Roman"/>
-              </w:rPr>
-              <w:t>[CV.TL]</w:t>
-            </w:r>
-            <w:r>
-              <w:rPr>
-                <w:rFonts w:ascii="Times New Roman" w:hAnsi="Times New Roman" w:cs="Times New Roman"/>
-              </w:rPr>
-              <w:t>.</w:t>
-            </w:r>
-            <w:r>
-              <w:rPr>
-                <w:rFonts w:ascii="Times New Roman" w:hAnsi="Times New Roman" w:cs="Times New Roman"/>
-              </w:rPr>
-              <w:t>Chức vụ/vị trí việc làm:</w:t>
-            </w:r>
-            <w:r>
-              <w:rPr>
-                <w:rFonts w:ascii="Times New Roman" w:hAnsi="Times New Roman" w:cs="Times New Roman"/>
-              </w:rPr>
-              <w:t xml:space="preserve"> [CV.TL]</w:t>
-            </w:r>
-            <w:r>
-              <w:rPr>
-                <w:rFonts w:ascii="Times New Roman" w:hAnsi="Times New Roman" w:cs="Times New Roman"/>
-              </w:rPr>
-              <w:t>.</w:t>
+              <w:t xml:space="preserve"> </w:t>
+            </w:r>
+            <w:r>
+              <w:rPr>
+                <w:rFonts w:ascii="Times New Roman" w:hAnsi="Times New Roman" w:cs="Times New Roman"/>
+              </w:rPr>
+              <w:t>Chủ hộ KD</w:t>
+            </w:r>
+            <w:r>
+              <w:rPr>
+                <w:rFonts w:ascii="Times New Roman" w:hAnsi="Times New Roman" w:cs="Times New Roman"/>
+              </w:rPr>
+              <w:t>.Chức vụ/vị trí việc làm</w:t>
+            </w:r>
+            <w:r>
+              <w:rPr>
+                <w:rFonts w:ascii="Times New Roman" w:hAnsi="Times New Roman" w:cs="Times New Roman"/>
+              </w:rPr>
+              <w:t>:</w:t>
+            </w:r>
+            <w:r>
+              <w:t xml:space="preserve"> </w:t>
+            </w:r>
+            <w:r>
+              <w:rPr>
+                <w:rFonts w:ascii="Times New Roman" w:hAnsi="Times New Roman" w:cs="Times New Roman"/>
+              </w:rPr>
+              <w:t>Chủ hộ KD.</w:t>
             </w:r>
             <w:r>
               <w:rPr>
@@ -8640,14 +8100,15 @@
               <w:rPr>
                 <w:rFonts w:ascii="Times New Roman" w:eastAsia="Arial Unicode MS" w:hAnsi="Times New Roman" w:cs="Times New Roman"/>
               </w:rPr>
-              <w:t>Mã số thuế cá nhân: ……………</w:t>
-            </w:r>
-            <w:r>
-              <w:rPr>
-                <w:rFonts w:ascii="Times New Roman" w:eastAsia="Arial Unicode MS" w:hAnsi="Times New Roman" w:cs="Times New Roman"/>
-                <w:i/>
-              </w:rPr>
-              <w:t xml:space="preserve">  </w:t>
+              <w:t xml:space="preserve">Mã số thuế cá nhân: </w:t>
+            </w:r>
+            <w:r>
+              <w:rPr>
+                <w:rFonts w:ascii="Times New Roman" w:hAnsi="Times New Roman"/>
+                <w:sz w:val="20"/>
+                <w:szCs w:val="20"/>
+              </w:rPr>
+              <w:t>[SoCC.GD]</w:t>
             </w:r>
           </w:p>
           <w:p>
@@ -8662,7 +8123,7 @@
               <w:rPr>
                 <w:rFonts w:ascii="Times New Roman" w:eastAsia="Arial Unicode MS" w:hAnsi="Times New Roman" w:cs="Times New Roman"/>
               </w:rPr>
-              <w:t>Quyết định bổ nhiệm:</w:t>
+              <w:t>Quyết định bổ nhiệm</w:t>
             </w:r>
             <w:r>
               <w:t xml:space="preserve"> </w:t>
@@ -8672,6 +8133,12 @@
                 <w:rFonts w:ascii="Times New Roman" w:eastAsia="Arial Unicode MS" w:hAnsi="Times New Roman" w:cs="Times New Roman"/>
               </w:rPr>
               <w:t>[QDBN.TL]</w:t>
+            </w:r>
+            <w:r>
+              <w:rPr>
+                <w:rFonts w:ascii="Times New Roman" w:eastAsia="Arial Unicode MS" w:hAnsi="Times New Roman" w:cs="Times New Roman"/>
+              </w:rPr>
+              <w:t>.</w:t>
             </w:r>
           </w:p>
           <w:p>
@@ -8683,15 +8150,423 @@
                 <w:lang w:val="pt-BR"/>
               </w:rPr>
             </w:pPr>
+            <w:r>
+              <w:rPr>
+                <w:rFonts w:ascii="Times New Roman" w:hAnsi="Times New Roman"/>
+                <w:lang w:val="de-DE"/>
+              </w:rPr>
+              <w:sym w:font="Wingdings" w:char="F0FE"/>
+            </w:r>
+            <w:r>
+              <w:rPr>
+                <w:rFonts w:ascii="Times New Roman" w:hAnsi="Times New Roman"/>
+                <w:lang w:val="pt-BR"/>
+              </w:rPr>
+              <w:t xml:space="preserve">Quốc tịch Việt Nam; </w:t>
+            </w:r>
+            <w:r>
+              <w:rPr>
+                <w:rFonts w:ascii="Times New Roman" w:hAnsi="Times New Roman"/>
+                <w:lang w:val="de-DE"/>
+              </w:rPr>
+              <w:sym w:font="Wingdings" w:char="F0A8"/>
+            </w:r>
+            <w:r>
+              <w:rPr>
+                <w:rFonts w:ascii="Times New Roman" w:hAnsi="Times New Roman"/>
+                <w:lang w:val="pt-BR"/>
+              </w:rPr>
+              <w:t xml:space="preserve">Quốc tịch khác…................................ Người cư trú: </w:t>
+            </w:r>
+            <w:r>
+              <w:rPr>
+                <w:rFonts w:ascii="Times New Roman" w:hAnsi="Times New Roman"/>
+                <w:lang w:val="de-DE"/>
+              </w:rPr>
+              <w:t xml:space="preserve"> </w:t>
+            </w:r>
+            <w:r>
+              <w:rPr>
+                <w:rFonts w:ascii="Times New Roman" w:hAnsi="Times New Roman"/>
+                <w:lang w:val="de-DE"/>
+              </w:rPr>
+              <w:sym w:font="Wingdings" w:char="F0FE"/>
+            </w:r>
+            <w:r>
+              <w:rPr>
+                <w:rFonts w:ascii="Times New Roman" w:hAnsi="Times New Roman"/>
+                <w:lang w:val="pt-BR"/>
+              </w:rPr>
+              <w:t xml:space="preserve"> Có </w:t>
+            </w:r>
+            <w:r>
+              <w:rPr>
+                <w:rFonts w:ascii="Times New Roman" w:hAnsi="Times New Roman"/>
+                <w:lang w:val="de-DE"/>
+              </w:rPr>
+              <w:t xml:space="preserve"> </w:t>
+            </w:r>
             <w:sdt>
               <w:sdtPr>
                 <w:rPr>
                   <w:rFonts w:ascii="Times New Roman" w:hAnsi="Times New Roman"/>
                   <w:lang w:val="de-DE"/>
                 </w:rPr>
-                <w:alias w:val="QTVN.TL"/>
-                <w:tag w:val="QTVN.TL"/>
-                <w:id w:val="219175920"/>
+                <w:id w:val="441881332"/>
+                <w14:checkbox>
+                  <w14:checked w14:val="0"/>
+                  <w14:checkedState w14:val="0052" w14:font="Wingdings 2"/>
+                  <w14:uncheckedState w14:val="2610" w14:font="MS Gothic"/>
+                </w14:checkbox>
+              </w:sdtPr>
+              <w:sdtContent>
+                <w:r>
+                  <w:rPr>
+                    <w:rFonts w:ascii="MS Gothic" w:eastAsia="MS Gothic" w:hAnsi="MS Gothic" w:hint="eastAsia"/>
+                    <w:lang w:val="de-DE"/>
+                  </w:rPr>
+                  <w:t>☐</w:t>
+                </w:r>
+              </w:sdtContent>
+            </w:sdt>
+            <w:r>
+              <w:rPr>
+                <w:rFonts w:ascii="Times New Roman" w:hAnsi="Times New Roman"/>
+                <w:lang w:val="pt-BR"/>
+              </w:rPr>
+              <w:t xml:space="preserve"> Không </w:t>
+            </w:r>
+          </w:p>
+          <w:p>
+            <w:pPr>
+              <w:pStyle w:val="ListParagraph"/>
+              <w:spacing w:before="40" w:beforeAutospacing="0" w:after="40" w:afterAutospacing="0"/>
+              <w:ind w:left="0"/>
+              <w:contextualSpacing w:val="0"/>
+              <w:rPr>
+                <w:rFonts w:ascii="Times New Roman" w:hAnsi="Times New Roman"/>
+                <w:lang w:val="pt-BR"/>
+              </w:rPr>
+            </w:pPr>
+            <w:r>
+              <w:rPr>
+                <w:rFonts w:ascii="Times New Roman" w:hAnsi="Times New Roman"/>
+                <w:lang w:val="pt-BR"/>
+              </w:rPr>
+              <w:t xml:space="preserve">Giấy tờ tùy thân: </w:t>
+            </w:r>
+            <w:r>
+              <w:rPr>
+                <w:rFonts w:ascii="Times New Roman" w:hAnsi="Times New Roman"/>
+                <w:lang w:val="de-DE"/>
+              </w:rPr>
+              <w:t xml:space="preserve"> </w:t>
+            </w:r>
+            <w:sdt>
+              <w:sdtPr>
+                <w:rPr>
+                  <w:rFonts w:ascii="Times New Roman" w:hAnsi="Times New Roman"/>
+                  <w:lang w:val="de-DE"/>
+                </w:rPr>
+                <w:alias w:val="CCCD.TL"/>
+                <w:tag w:val="CCCD.TL"/>
+                <w:id w:val="-130246892"/>
+                <w14:checkbox>
+                  <w14:checked w14:val="0"/>
+                  <w14:checkedState w14:val="0052" w14:font="Wingdings 2"/>
+                  <w14:uncheckedState w14:val="2610" w14:font="MS Gothic"/>
+                </w14:checkbox>
+              </w:sdtPr>
+              <w:sdtContent>
+                <w:r>
+                  <w:rPr>
+                    <w:rFonts w:ascii="MS Gothic" w:eastAsia="MS Gothic" w:hAnsi="MS Gothic" w:hint="eastAsia"/>
+                    <w:lang w:val="de-DE"/>
+                  </w:rPr>
+                  <w:t>☐</w:t>
+                </w:r>
+              </w:sdtContent>
+            </w:sdt>
+            <w:r>
+              <w:rPr>
+                <w:rFonts w:ascii="Times New Roman" w:hAnsi="Times New Roman"/>
+                <w:lang w:val="pt-BR"/>
+              </w:rPr>
+              <w:t xml:space="preserve"> Căn cước; </w:t>
+            </w:r>
+            <w:r>
+              <w:rPr>
+                <w:rFonts w:ascii="Times New Roman" w:hAnsi="Times New Roman"/>
+                <w:lang w:val="de-DE"/>
+              </w:rPr>
+              <w:t xml:space="preserve"> </w:t>
+            </w:r>
+            <w:sdt>
+              <w:sdtPr>
+                <w:rPr>
+                  <w:rFonts w:ascii="Times New Roman" w:hAnsi="Times New Roman"/>
+                  <w:lang w:val="de-DE"/>
+                </w:rPr>
+                <w:alias w:val="CC.TL"/>
+                <w:tag w:val="CC.TL"/>
+                <w:id w:val="937875045"/>
+                <w14:checkbox>
+                  <w14:checked w14:val="0"/>
+                  <w14:checkedState w14:val="0052" w14:font="Wingdings 2"/>
+                  <w14:uncheckedState w14:val="2610" w14:font="MS Gothic"/>
+                </w14:checkbox>
+              </w:sdtPr>
+              <w:sdtContent>
+                <w:r>
+                  <w:rPr>
+                    <w:rFonts w:ascii="MS Gothic" w:eastAsia="MS Gothic" w:hAnsi="MS Gothic" w:hint="eastAsia"/>
+                    <w:lang w:val="de-DE"/>
+                  </w:rPr>
+                  <w:t>☐</w:t>
+                </w:r>
+              </w:sdtContent>
+            </w:sdt>
+            <w:r>
+              <w:rPr>
+                <w:rFonts w:ascii="Times New Roman" w:hAnsi="Times New Roman"/>
+                <w:lang w:val="pt-BR"/>
+              </w:rPr>
+              <w:t xml:space="preserve">  CCCD; </w:t>
+            </w:r>
+            <w:r>
+              <w:rPr>
+                <w:rFonts w:ascii="Times New Roman" w:hAnsi="Times New Roman"/>
+                <w:lang w:val="de-DE"/>
+              </w:rPr>
+              <w:t xml:space="preserve"> </w:t>
+            </w:r>
+            <w:sdt>
+              <w:sdtPr>
+                <w:rPr>
+                  <w:rFonts w:ascii="Times New Roman" w:hAnsi="Times New Roman"/>
+                  <w:lang w:val="de-DE"/>
+                </w:rPr>
+                <w:alias w:val="CCDT.TL"/>
+                <w:tag w:val="CCDT.TL"/>
+                <w:id w:val="1087272884"/>
+                <w14:checkbox>
+                  <w14:checked w14:val="0"/>
+                  <w14:checkedState w14:val="0052" w14:font="Wingdings 2"/>
+                  <w14:uncheckedState w14:val="2610" w14:font="MS Gothic"/>
+                </w14:checkbox>
+              </w:sdtPr>
+              <w:sdtContent>
+                <w:r>
+                  <w:rPr>
+                    <w:rFonts w:ascii="MS Gothic" w:eastAsia="MS Gothic" w:hAnsi="MS Gothic" w:hint="eastAsia"/>
+                    <w:lang w:val="de-DE"/>
+                  </w:rPr>
+                  <w:t>☐</w:t>
+                </w:r>
+              </w:sdtContent>
+            </w:sdt>
+            <w:r>
+              <w:rPr>
+                <w:rFonts w:ascii="Times New Roman" w:hAnsi="Times New Roman"/>
+                <w:lang w:val="pt-BR"/>
+              </w:rPr>
+              <w:t xml:space="preserve">  CCCD Điện tử; </w:t>
+            </w:r>
+            <w:r>
+              <w:rPr>
+                <w:rFonts w:ascii="Times New Roman" w:hAnsi="Times New Roman"/>
+                <w:lang w:val="de-DE"/>
+              </w:rPr>
+              <w:t xml:space="preserve"> </w:t>
+            </w:r>
+            <w:sdt>
+              <w:sdtPr>
+                <w:rPr>
+                  <w:rFonts w:ascii="Times New Roman" w:hAnsi="Times New Roman"/>
+                  <w:lang w:val="de-DE"/>
+                </w:rPr>
+                <w:alias w:val="CNCC.TL"/>
+                <w:tag w:val="CNCC.TL"/>
+                <w:id w:val="-1811700044"/>
+                <w14:checkbox>
+                  <w14:checked w14:val="0"/>
+                  <w14:checkedState w14:val="0052" w14:font="Wingdings 2"/>
+                  <w14:uncheckedState w14:val="2610" w14:font="MS Gothic"/>
+                </w14:checkbox>
+              </w:sdtPr>
+              <w:sdtContent>
+                <w:r>
+                  <w:rPr>
+                    <w:rFonts w:ascii="MS Gothic" w:eastAsia="MS Gothic" w:hAnsi="MS Gothic" w:hint="eastAsia"/>
+                    <w:lang w:val="de-DE"/>
+                  </w:rPr>
+                  <w:t>☐</w:t>
+                </w:r>
+              </w:sdtContent>
+            </w:sdt>
+            <w:r>
+              <w:rPr>
+                <w:rFonts w:ascii="Times New Roman" w:hAnsi="Times New Roman"/>
+                <w:lang w:val="pt-BR"/>
+              </w:rPr>
+              <w:t xml:space="preserve">  Giấy CNCC</w:t>
+            </w:r>
+          </w:p>
+          <w:p>
+            <w:pPr>
+              <w:pStyle w:val="ListParagraph"/>
+              <w:spacing w:before="40" w:beforeAutospacing="0" w:after="40" w:afterAutospacing="0"/>
+              <w:ind w:left="0"/>
+              <w:contextualSpacing w:val="0"/>
+              <w:rPr>
+                <w:rFonts w:ascii="Times New Roman" w:hAnsi="Times New Roman"/>
+                <w:lang w:val="pt-BR"/>
+              </w:rPr>
+            </w:pPr>
+            <w:r>
+              <w:rPr>
+                <w:rFonts w:ascii="Times New Roman" w:hAnsi="Times New Roman"/>
+                <w:lang w:val="pt-BR"/>
+              </w:rPr>
+              <w:t xml:space="preserve">Số: </w:t>
+            </w:r>
+            <w:r>
+              <w:rPr>
+                <w:rFonts w:ascii="Times New Roman" w:hAnsi="Times New Roman"/>
+                <w:lang w:val="pt-BR"/>
+              </w:rPr>
+              <w:t>[SoCC.GD]</w:t>
+            </w:r>
+            <w:r>
+              <w:rPr>
+                <w:rFonts w:ascii="Times New Roman" w:hAnsi="Times New Roman"/>
+                <w:lang w:val="pt-BR"/>
+              </w:rPr>
+              <w:t xml:space="preserve">. </w:t>
+            </w:r>
+            <w:r>
+              <w:rPr>
+                <w:rFonts w:ascii="Times New Roman" w:hAnsi="Times New Roman"/>
+                <w:lang w:val="pt-BR"/>
+              </w:rPr>
+              <w:t xml:space="preserve">Ngày cấp: </w:t>
+            </w:r>
+            <w:r>
+              <w:t xml:space="preserve"> </w:t>
+            </w:r>
+            <w:r>
+              <w:rPr>
+                <w:rFonts w:ascii="Times New Roman" w:hAnsi="Times New Roman"/>
+                <w:lang w:val="pt-BR"/>
+              </w:rPr>
+              <w:t>[NgC.GD]</w:t>
+            </w:r>
+            <w:r>
+              <w:rPr>
+                <w:rFonts w:ascii="Times New Roman" w:hAnsi="Times New Roman"/>
+                <w:lang w:val="pt-BR"/>
+              </w:rPr>
+              <w:t>.</w:t>
+            </w:r>
+            <w:r>
+              <w:rPr>
+                <w:rFonts w:ascii="Times New Roman" w:hAnsi="Times New Roman"/>
+                <w:lang w:val="pt-BR"/>
+              </w:rPr>
+              <w:t xml:space="preserve">  Nơi cấp:</w:t>
+            </w:r>
+            <w:r>
+              <w:rPr>
+                <w:rFonts w:ascii="Times New Roman" w:hAnsi="Times New Roman"/>
+                <w:lang w:val="pt-BR"/>
+              </w:rPr>
+              <w:t xml:space="preserve"> </w:t>
+            </w:r>
+            <w:r>
+              <w:rPr>
+                <w:rFonts w:ascii="Times New Roman" w:hAnsi="Times New Roman"/>
+                <w:lang w:val="pt-BR"/>
+              </w:rPr>
+              <w:t>[NC.GD]</w:t>
+            </w:r>
+            <w:r>
+              <w:rPr>
+                <w:rFonts w:ascii="Times New Roman" w:hAnsi="Times New Roman"/>
+                <w:lang w:val="pt-BR"/>
+              </w:rPr>
+              <w:t>.</w:t>
+            </w:r>
+            <w:r>
+              <w:rPr>
+                <w:rFonts w:ascii="Times New Roman" w:hAnsi="Times New Roman"/>
+                <w:lang w:val="pt-BR"/>
+              </w:rPr>
+              <w:t xml:space="preserve"> </w:t>
+            </w:r>
+            <w:r>
+              <w:rPr>
+                <w:rFonts w:ascii="Times New Roman" w:hAnsi="Times New Roman"/>
+                <w:lang w:val="pt-BR"/>
+              </w:rPr>
+              <w:t xml:space="preserve"> Ngày hết hạn HL: </w:t>
+            </w:r>
+            <w:r>
+              <w:t xml:space="preserve"> </w:t>
+            </w:r>
+            <w:r>
+              <w:rPr>
+                <w:rFonts w:ascii="Times New Roman" w:hAnsi="Times New Roman"/>
+                <w:lang w:val="pt-BR"/>
+              </w:rPr>
+              <w:t>[NgHH.GD]</w:t>
+            </w:r>
+          </w:p>
+          <w:p>
+            <w:pPr>
+              <w:pStyle w:val="ListParagraph"/>
+              <w:spacing w:before="40" w:beforeAutospacing="0" w:after="40" w:afterAutospacing="0"/>
+              <w:ind w:left="0"/>
+              <w:contextualSpacing w:val="0"/>
+              <w:rPr>
+                <w:rFonts w:ascii="Times New Roman" w:hAnsi="Times New Roman"/>
+                <w:lang w:val="pt-BR"/>
+              </w:rPr>
+            </w:pPr>
+            <w:r>
+              <w:rPr>
+                <w:rFonts w:ascii="Times New Roman" w:hAnsi="Times New Roman"/>
+                <w:lang w:val="pt-BR"/>
+              </w:rPr>
+              <w:t xml:space="preserve">Giấy tờ đối với KH là người </w:t>
+            </w:r>
+            <w:r>
+              <w:rPr>
+                <w:rFonts w:ascii="Times New Roman" w:hAnsi="Times New Roman"/>
+                <w:lang w:val="pt-BR"/>
+              </w:rPr>
+              <w:t>NN</w:t>
+            </w:r>
+            <w:r>
+              <w:rPr>
+                <w:rFonts w:ascii="Times New Roman" w:hAnsi="Times New Roman"/>
+                <w:lang w:val="pt-BR"/>
+              </w:rPr>
+              <w:t xml:space="preserve">: </w:t>
+            </w:r>
+            <w:r>
+              <w:rPr>
+                <w:rFonts w:ascii="Times New Roman" w:hAnsi="Times New Roman"/>
+                <w:lang w:val="de-DE"/>
+              </w:rPr>
+              <w:t xml:space="preserve"> </w:t>
+            </w:r>
+            <w:sdt>
+              <w:sdtPr>
+                <w:rPr>
+                  <w:rFonts w:ascii="Times New Roman" w:hAnsi="Times New Roman"/>
+                  <w:lang w:val="de-DE"/>
+                </w:rPr>
+                <w:id w:val="-1685044877"/>
                 <w14:checkbox>
                   <w14:checked w14:val="1"/>
                   <w14:checkedState w14:val="0052" w14:font="Wingdings 2"/>
@@ -8713,7 +8588,14 @@
                 <w:rFonts w:ascii="Times New Roman" w:hAnsi="Times New Roman"/>
                 <w:lang w:val="pt-BR"/>
               </w:rPr>
-              <w:t xml:space="preserve"> Quốc tịch Việt Nam; </w:t>
+              <w:t xml:space="preserve"> Hộ chiếu;</w:t>
+            </w:r>
+            <w:r>
+              <w:rPr>
+                <w:rFonts w:ascii="Times New Roman" w:hAnsi="Times New Roman"/>
+                <w:lang w:val="de-DE"/>
+              </w:rPr>
+              <w:t xml:space="preserve"> </w:t>
             </w:r>
             <w:sdt>
               <w:sdtPr>
@@ -8721,9 +8603,44 @@
                   <w:rFonts w:ascii="Times New Roman" w:hAnsi="Times New Roman"/>
                   <w:lang w:val="de-DE"/>
                 </w:rPr>
-                <w:alias w:val="QTK.TL"/>
-                <w:tag w:val="QTK.TL"/>
-                <w:id w:val="1336192312"/>
+                <w:id w:val="869106319"/>
+                <w14:checkbox>
+                  <w14:checked w14:val="1"/>
+                  <w14:checkedState w14:val="0052" w14:font="Wingdings 2"/>
+                  <w14:uncheckedState w14:val="2610" w14:font="MS Gothic"/>
+                </w14:checkbox>
+              </w:sdtPr>
+              <w:sdtContent>
+                <w:r>
+                  <w:rPr>
+                    <w:rFonts w:ascii="Times New Roman" w:hAnsi="Times New Roman"/>
+                    <w:lang w:val="de-DE"/>
+                  </w:rPr>
+                  <w:sym w:font="Wingdings 2" w:char="F052"/>
+                </w:r>
+              </w:sdtContent>
+            </w:sdt>
+            <w:r>
+              <w:rPr>
+                <w:rFonts w:ascii="Times New Roman" w:hAnsi="Times New Roman"/>
+                <w:lang w:val="pt-BR"/>
+              </w:rPr>
+              <w:t xml:space="preserve"> Thị thực;</w:t>
+            </w:r>
+            <w:r>
+              <w:rPr>
+                <w:rFonts w:ascii="Times New Roman" w:hAnsi="Times New Roman"/>
+                <w:lang w:val="de-DE"/>
+              </w:rPr>
+              <w:t xml:space="preserve"> </w:t>
+            </w:r>
+            <w:sdt>
+              <w:sdtPr>
+                <w:rPr>
+                  <w:rFonts w:ascii="Times New Roman" w:hAnsi="Times New Roman"/>
+                  <w:lang w:val="de-DE"/>
+                </w:rPr>
+                <w:id w:val="256574747"/>
                 <w14:checkbox>
                   <w14:checked w14:val="0"/>
                   <w14:checkedState w14:val="0052" w14:font="Wingdings 2"/>
@@ -8745,7 +8662,21 @@
                 <w:rFonts w:ascii="Times New Roman" w:hAnsi="Times New Roman"/>
                 <w:lang w:val="pt-BR"/>
               </w:rPr>
-              <w:t xml:space="preserve"> Quốc tịch khác….............................. Người cư trú: </w:t>
+              <w:t xml:space="preserve"> Giấy miễn thị thực</w:t>
+            </w:r>
+            <w:r>
+              <w:rPr>
+                <w:rFonts w:ascii="Times New Roman" w:hAnsi="Times New Roman"/>
+                <w:lang w:val="pt-BR"/>
+              </w:rPr>
+              <w:t>;</w:t>
+            </w:r>
+            <w:r>
+              <w:rPr>
+                <w:rFonts w:ascii="Times New Roman" w:hAnsi="Times New Roman"/>
+                <w:lang w:val="de-DE"/>
+              </w:rPr>
+              <w:t xml:space="preserve"> </w:t>
             </w:r>
             <w:sdt>
               <w:sdtPr>
@@ -8753,7 +8684,7 @@
                   <w:rFonts w:ascii="Times New Roman" w:hAnsi="Times New Roman"/>
                   <w:lang w:val="de-DE"/>
                 </w:rPr>
-                <w:id w:val="-375161534"/>
+                <w:id w:val="442736812"/>
                 <w14:checkbox>
                   <w14:checked w14:val="0"/>
                   <w14:checkedState w14:val="0052" w14:font="Wingdings 2"/>
@@ -8775,44 +8706,7 @@
                 <w:rFonts w:ascii="Times New Roman" w:hAnsi="Times New Roman"/>
                 <w:lang w:val="pt-BR"/>
               </w:rPr>
-              <w:t xml:space="preserve"> Có </w:t>
-            </w:r>
-            <w:r>
-              <w:rPr>
-                <w:rFonts w:ascii="Times New Roman" w:hAnsi="Times New Roman"/>
-                <w:lang w:val="de-DE"/>
-              </w:rPr>
-              <w:t xml:space="preserve"> </w:t>
-            </w:r>
-            <w:sdt>
-              <w:sdtPr>
-                <w:rPr>
-                  <w:rFonts w:ascii="Times New Roman" w:hAnsi="Times New Roman"/>
-                  <w:lang w:val="de-DE"/>
-                </w:rPr>
-                <w:id w:val="-1435277978"/>
-                <w14:checkbox>
-                  <w14:checked w14:val="0"/>
-                  <w14:checkedState w14:val="0052" w14:font="Wingdings 2"/>
-                  <w14:uncheckedState w14:val="2610" w14:font="MS Gothic"/>
-                </w14:checkbox>
-              </w:sdtPr>
-              <w:sdtContent>
-                <w:r>
-                  <w:rPr>
-                    <w:rFonts w:ascii="MS Gothic" w:eastAsia="MS Gothic" w:hAnsi="MS Gothic" w:hint="eastAsia"/>
-                    <w:lang w:val="de-DE"/>
-                  </w:rPr>
-                  <w:t>☐</w:t>
-                </w:r>
-              </w:sdtContent>
-            </w:sdt>
-            <w:r>
-              <w:rPr>
-                <w:rFonts w:ascii="Times New Roman" w:hAnsi="Times New Roman"/>
-                <w:lang w:val="pt-BR"/>
-              </w:rPr>
-              <w:t xml:space="preserve"> Không </w:t>
+              <w:t xml:space="preserve"> Định danh</w:t>
             </w:r>
           </w:p>
           <w:p>
@@ -8831,163 +8725,7 @@
                 <w:rFonts w:ascii="Times New Roman" w:hAnsi="Times New Roman"/>
                 <w:lang w:val="pt-BR"/>
               </w:rPr>
-              <w:t xml:space="preserve">Giấy tờ tùy thân: </w:t>
-            </w:r>
-            <w:sdt>
-              <w:sdtPr>
-                <w:rPr>
-                  <w:rFonts w:ascii="Times New Roman" w:hAnsi="Times New Roman"/>
-                  <w:lang w:val="de-DE"/>
-                </w:rPr>
-                <w:alias w:val="CCCD.TL"/>
-                <w:tag w:val="CCCD.TL"/>
-                <w:id w:val="-914245051"/>
-                <w14:checkbox>
-                  <w14:checked w14:val="0"/>
-                  <w14:checkedState w14:val="0052" w14:font="Wingdings 2"/>
-                  <w14:uncheckedState w14:val="2610" w14:font="MS Gothic"/>
-                </w14:checkbox>
-              </w:sdtPr>
-              <w:sdtContent>
-                <w:r>
-                  <w:rPr>
-                    <w:rFonts w:ascii="MS Gothic" w:eastAsia="MS Gothic" w:hAnsi="MS Gothic" w:hint="eastAsia"/>
-                    <w:lang w:val="de-DE"/>
-                  </w:rPr>
-                  <w:t>☐</w:t>
-                </w:r>
-              </w:sdtContent>
-            </w:sdt>
-            <w:r>
-              <w:rPr>
-                <w:rFonts w:ascii="Times New Roman" w:hAnsi="Times New Roman"/>
-                <w:lang w:val="pt-BR"/>
-              </w:rPr>
-              <w:t xml:space="preserve"> Căn cước; </w:t>
-            </w:r>
-            <w:r>
-              <w:rPr>
-                <w:rFonts w:ascii="Times New Roman" w:hAnsi="Times New Roman"/>
-                <w:lang w:val="de-DE"/>
-              </w:rPr>
-              <w:t xml:space="preserve"> </w:t>
-            </w:r>
-            <w:sdt>
-              <w:sdtPr>
-                <w:rPr>
-                  <w:rFonts w:ascii="Times New Roman" w:hAnsi="Times New Roman"/>
-                  <w:lang w:val="de-DE"/>
-                </w:rPr>
-                <w:alias w:val="CC.TL"/>
-                <w:tag w:val="CC.TL"/>
-                <w:id w:val="1089818786"/>
-                <w14:checkbox>
-                  <w14:checked w14:val="0"/>
-                  <w14:checkedState w14:val="0052" w14:font="Wingdings 2"/>
-                  <w14:uncheckedState w14:val="2610" w14:font="MS Gothic"/>
-                </w14:checkbox>
-              </w:sdtPr>
-              <w:sdtContent>
-                <w:r>
-                  <w:rPr>
-                    <w:rFonts w:ascii="MS Gothic" w:eastAsia="MS Gothic" w:hAnsi="MS Gothic" w:hint="eastAsia"/>
-                    <w:lang w:val="de-DE"/>
-                  </w:rPr>
-                  <w:t>☐</w:t>
-                </w:r>
-              </w:sdtContent>
-            </w:sdt>
-            <w:r>
-              <w:rPr>
-                <w:rFonts w:ascii="Times New Roman" w:hAnsi="Times New Roman"/>
-                <w:lang w:val="pt-BR"/>
-              </w:rPr>
-              <w:t xml:space="preserve">  CCCD; </w:t>
-            </w:r>
-            <w:r>
-              <w:rPr>
-                <w:rFonts w:ascii="Times New Roman" w:hAnsi="Times New Roman"/>
-                <w:lang w:val="de-DE"/>
-              </w:rPr>
-              <w:t xml:space="preserve"> </w:t>
-            </w:r>
-            <w:sdt>
-              <w:sdtPr>
-                <w:rPr>
-                  <w:rFonts w:ascii="Times New Roman" w:hAnsi="Times New Roman"/>
-                  <w:lang w:val="de-DE"/>
-                </w:rPr>
-                <w:alias w:val="CCDT.TL"/>
-                <w:tag w:val="CCDT.TL"/>
-                <w:id w:val="-1436051855"/>
-                <w14:checkbox>
-                  <w14:checked w14:val="0"/>
-                  <w14:checkedState w14:val="0052" w14:font="Wingdings 2"/>
-                  <w14:uncheckedState w14:val="2610" w14:font="MS Gothic"/>
-                </w14:checkbox>
-              </w:sdtPr>
-              <w:sdtContent>
-                <w:r>
-                  <w:rPr>
-                    <w:rFonts w:ascii="MS Gothic" w:eastAsia="MS Gothic" w:hAnsi="MS Gothic" w:hint="eastAsia"/>
-                    <w:lang w:val="de-DE"/>
-                  </w:rPr>
-                  <w:t>☐</w:t>
-                </w:r>
-              </w:sdtContent>
-            </w:sdt>
-            <w:r>
-              <w:rPr>
-                <w:rFonts w:ascii="Times New Roman" w:hAnsi="Times New Roman"/>
-                <w:lang w:val="pt-BR"/>
-              </w:rPr>
-              <w:t xml:space="preserve">  CCCD Điện tử; </w:t>
-            </w:r>
-            <w:r>
-              <w:rPr>
-                <w:rFonts w:ascii="Times New Roman" w:hAnsi="Times New Roman"/>
-                <w:lang w:val="de-DE"/>
-              </w:rPr>
-              <w:t xml:space="preserve"> </w:t>
-            </w:r>
-            <w:sdt>
-              <w:sdtPr>
-                <w:rPr>
-                  <w:rFonts w:ascii="Times New Roman" w:hAnsi="Times New Roman"/>
-                  <w:lang w:val="de-DE"/>
-                </w:rPr>
-                <w:alias w:val="CNCC.TL"/>
-                <w:tag w:val="CNCC.TL"/>
-                <w:id w:val="-698008139"/>
-                <w14:checkbox>
-                  <w14:checked w14:val="0"/>
-                  <w14:checkedState w14:val="0052" w14:font="Wingdings 2"/>
-                  <w14:uncheckedState w14:val="2610" w14:font="MS Gothic"/>
-                </w14:checkbox>
-              </w:sdtPr>
-              <w:sdtContent>
-                <w:r>
-                  <w:rPr>
-                    <w:rFonts w:ascii="MS Gothic" w:eastAsia="MS Gothic" w:hAnsi="MS Gothic" w:hint="eastAsia"/>
-                    <w:lang w:val="de-DE"/>
-                  </w:rPr>
-                  <w:t>☐</w:t>
-                </w:r>
-              </w:sdtContent>
-            </w:sdt>
-            <w:r>
-              <w:rPr>
-                <w:rFonts w:ascii="Times New Roman" w:hAnsi="Times New Roman"/>
-                <w:lang w:val="pt-BR"/>
-              </w:rPr>
-              <w:t xml:space="preserve"> </w:t>
-            </w:r>
-            <w:r>
-              <w:rPr>
-                <w:rFonts w:ascii="Times New Roman" w:hAnsi="Times New Roman"/>
-                <w:lang w:val="pt-BR"/>
-              </w:rPr>
-              <w:t>Giấy CNCC</w:t>
+              <w:t>Số: ........................ Ngày cấp: .../…/........   Nơi cấp:………. Ngày hết hạn HL: …/…/…</w:t>
             </w:r>
           </w:p>
           <w:p>
@@ -9006,112 +8744,31 @@
                 <w:rFonts w:ascii="Times New Roman" w:hAnsi="Times New Roman"/>
                 <w:lang w:val="pt-BR"/>
               </w:rPr>
-              <w:t>Số</w:t>
-            </w:r>
-            <w:r>
-              <w:rPr>
-                <w:rFonts w:ascii="Times New Roman" w:hAnsi="Times New Roman"/>
-                <w:lang w:val="pt-BR"/>
-              </w:rPr>
-              <w:t xml:space="preserve">: </w:t>
-            </w:r>
-            <w:r>
-              <w:rPr>
-                <w:rFonts w:ascii="Times New Roman" w:hAnsi="Times New Roman"/>
-                <w:lang w:val="pt-BR"/>
-              </w:rPr>
-              <w:t>[SoCC.</w:t>
-            </w:r>
-            <w:r>
-              <w:rPr>
-                <w:rFonts w:ascii="Times New Roman" w:hAnsi="Times New Roman"/>
-                <w:lang w:val="pt-BR"/>
-              </w:rPr>
-              <w:t>T</w:t>
-            </w:r>
-            <w:r>
-              <w:rPr>
-                <w:rFonts w:ascii="Times New Roman" w:hAnsi="Times New Roman"/>
-                <w:lang w:val="pt-BR"/>
-              </w:rPr>
-              <w:t>L]</w:t>
-            </w:r>
-            <w:r>
-              <w:rPr>
-                <w:rFonts w:ascii="Times New Roman" w:hAnsi="Times New Roman"/>
-                <w:lang w:val="pt-BR"/>
-              </w:rPr>
-              <w:t xml:space="preserve">. Ngày cấp: </w:t>
-            </w:r>
-            <w:r>
-              <w:rPr>
-                <w:rFonts w:ascii="Times New Roman" w:hAnsi="Times New Roman"/>
-                <w:lang w:val="pt-BR"/>
-              </w:rPr>
-              <w:t>[NgC.</w:t>
-            </w:r>
-            <w:r>
-              <w:rPr>
-                <w:rFonts w:ascii="Times New Roman" w:hAnsi="Times New Roman"/>
-                <w:lang w:val="pt-BR"/>
-              </w:rPr>
-              <w:t>T</w:t>
-            </w:r>
-            <w:r>
-              <w:rPr>
-                <w:rFonts w:ascii="Times New Roman" w:hAnsi="Times New Roman"/>
-                <w:lang w:val="pt-BR"/>
-              </w:rPr>
-              <w:t>L]</w:t>
-            </w:r>
-            <w:r>
-              <w:rPr>
-                <w:rFonts w:ascii="Times New Roman" w:hAnsi="Times New Roman"/>
-                <w:lang w:val="pt-BR"/>
-              </w:rPr>
-              <w:t>.</w:t>
-            </w:r>
-            <w:r>
-              <w:rPr>
-                <w:rFonts w:ascii="Times New Roman" w:hAnsi="Times New Roman"/>
-                <w:lang w:val="pt-BR"/>
-              </w:rPr>
-              <w:t xml:space="preserve"> Nơi cấp:</w:t>
-            </w:r>
-            <w:r>
-              <w:rPr>
-                <w:rFonts w:ascii="Times New Roman" w:hAnsi="Times New Roman"/>
-                <w:lang w:val="pt-BR"/>
-              </w:rPr>
-              <w:t xml:space="preserve"> [NC.</w:t>
-            </w:r>
-            <w:r>
-              <w:rPr>
-                <w:rFonts w:ascii="Times New Roman" w:hAnsi="Times New Roman"/>
-                <w:lang w:val="pt-BR"/>
-              </w:rPr>
-              <w:t>TL</w:t>
-            </w:r>
-            <w:r>
-              <w:rPr>
-                <w:rFonts w:ascii="Times New Roman" w:hAnsi="Times New Roman"/>
-                <w:lang w:val="pt-BR"/>
-              </w:rPr>
-              <w:t>]</w:t>
-            </w:r>
-            <w:r>
-              <w:rPr>
-                <w:rFonts w:ascii="Times New Roman" w:hAnsi="Times New Roman"/>
-                <w:lang w:val="pt-BR"/>
-              </w:rPr>
-              <w:t xml:space="preserve">. Ngày hết hạn HL: </w:t>
-            </w:r>
-            <w:r>
-              <w:rPr>
-                <w:rFonts w:ascii="Times New Roman" w:hAnsi="Times New Roman"/>
-                <w:lang w:val="pt-BR"/>
-              </w:rPr>
-              <w:t>[NgHH.TL]</w:t>
+              <w:t xml:space="preserve">Địa chỉ đăng ký </w:t>
+            </w:r>
+            <w:r>
+              <w:rPr>
+                <w:rFonts w:ascii="Times New Roman" w:hAnsi="Times New Roman"/>
+                <w:lang w:val="pt-BR"/>
+              </w:rPr>
+              <w:t>tạm t</w:t>
+            </w:r>
+            <w:r>
+              <w:rPr>
+                <w:rFonts w:ascii="Times New Roman" w:hAnsi="Times New Roman"/>
+                <w:lang w:val="pt-BR"/>
+              </w:rPr>
+              <w:t>rú/thường trú tại VN:</w:t>
+            </w:r>
+            <w:r>
+              <w:t xml:space="preserve"> </w:t>
+            </w:r>
+            <w:r>
+              <w:rPr>
+                <w:rFonts w:ascii="Times New Roman" w:hAnsi="Times New Roman"/>
+                <w:lang w:val="pt-BR"/>
+              </w:rPr>
+              <w:t>[DC.GD]</w:t>
             </w:r>
           </w:p>
           <w:p>
@@ -9130,63 +8787,34 @@
                 <w:rFonts w:ascii="Times New Roman" w:hAnsi="Times New Roman"/>
                 <w:lang w:val="pt-BR"/>
               </w:rPr>
-              <w:t xml:space="preserve">Giấy tờ đối với KH là người </w:t>
-            </w:r>
-            <w:r>
-              <w:rPr>
-                <w:rFonts w:ascii="Times New Roman" w:hAnsi="Times New Roman"/>
-                <w:lang w:val="pt-BR"/>
-              </w:rPr>
-              <w:t>NN</w:t>
-            </w:r>
-            <w:r>
-              <w:rPr>
-                <w:rFonts w:ascii="Times New Roman" w:hAnsi="Times New Roman"/>
-                <w:lang w:val="pt-BR"/>
-              </w:rPr>
-              <w:t xml:space="preserve">: </w:t>
-            </w:r>
-            <w:r>
-              <w:rPr>
-                <w:rFonts w:ascii="Times New Roman" w:hAnsi="Times New Roman"/>
-                <w:lang w:val="pt-BR"/>
-              </w:rPr>
-              <w:t xml:space="preserve"> Hộ chiếu; </w:t>
-            </w:r>
-            <w:r>
-              <w:rPr>
-                <w:rFonts w:ascii="Times New Roman" w:hAnsi="Times New Roman"/>
-                <w:lang w:val="pt-BR"/>
-              </w:rPr>
-              <w:t xml:space="preserve"> Thị thực; </w:t>
-            </w:r>
-            <w:r>
-              <w:rPr>
-                <w:rFonts w:ascii="Times New Roman" w:hAnsi="Times New Roman"/>
-                <w:lang w:val="pt-BR"/>
-              </w:rPr>
-              <w:t xml:space="preserve"> </w:t>
-            </w:r>
-            <w:r>
-              <w:rPr>
-                <w:rFonts w:ascii="Times New Roman" w:hAnsi="Times New Roman"/>
-                <w:lang w:val="pt-BR"/>
-              </w:rPr>
-              <w:t>Giấy miễn thị thực</w:t>
-            </w:r>
-            <w:r>
-              <w:rPr>
-                <w:rFonts w:ascii="Times New Roman" w:hAnsi="Times New Roman"/>
-                <w:lang w:val="pt-BR"/>
-              </w:rPr>
-              <w:t xml:space="preserve">; </w:t>
-            </w:r>
-            <w:r>
-              <w:rPr>
-                <w:rFonts w:ascii="Times New Roman" w:hAnsi="Times New Roman"/>
-                <w:lang w:val="pt-BR"/>
-              </w:rPr>
-              <w:t> Định danh</w:t>
+              <w:t xml:space="preserve">Nơi ở hiện tại: </w:t>
+            </w:r>
+            <w:r>
+              <w:t xml:space="preserve"> </w:t>
+            </w:r>
+            <w:r>
+              <w:rPr>
+                <w:rFonts w:ascii="Times New Roman" w:hAnsi="Times New Roman"/>
+                <w:lang w:val="pt-BR"/>
+              </w:rPr>
+              <w:t>[DC.GD]</w:t>
+            </w:r>
+            <w:r>
+              <w:rPr>
+                <w:rFonts w:ascii="Times New Roman" w:hAnsi="Times New Roman"/>
+                <w:lang w:val="pt-BR"/>
+              </w:rPr>
+              <w:t xml:space="preserve">. Số điện thoại: </w:t>
+            </w:r>
+            <w:r>
+              <w:t xml:space="preserve"> </w:t>
+            </w:r>
+            <w:r>
+              <w:rPr>
+                <w:rFonts w:ascii="Times New Roman" w:hAnsi="Times New Roman"/>
+                <w:lang w:val="pt-BR"/>
+              </w:rPr>
+              <w:t>[SoDT.GD]</w:t>
             </w:r>
           </w:p>
           <w:p>
@@ -9205,169 +8833,21 @@
                 <w:rFonts w:ascii="Times New Roman" w:hAnsi="Times New Roman"/>
                 <w:lang w:val="pt-BR"/>
               </w:rPr>
-              <w:t>Số: ........................... Ngày cấp: .../…/........   Nơi cấp:……….…….  Ngày hết hạn HL: …/…/…</w:t>
-            </w:r>
-          </w:p>
-          <w:p>
-            <w:pPr>
-              <w:pStyle w:val="ListParagraph"/>
-              <w:spacing w:before="40" w:beforeAutospacing="0" w:after="40" w:afterAutospacing="0"/>
-              <w:ind w:left="0"/>
-              <w:contextualSpacing w:val="0"/>
-              <w:rPr>
-                <w:rFonts w:ascii="Times New Roman" w:hAnsi="Times New Roman"/>
-                <w:lang w:val="pt-BR"/>
-              </w:rPr>
-            </w:pPr>
-            <w:r>
-              <w:rPr>
-                <w:rFonts w:ascii="Times New Roman" w:hAnsi="Times New Roman"/>
-                <w:lang w:val="pt-BR"/>
-              </w:rPr>
-              <w:t xml:space="preserve">Địa chỉ đăng ký </w:t>
-            </w:r>
-            <w:r>
-              <w:rPr>
-                <w:rFonts w:ascii="Times New Roman" w:hAnsi="Times New Roman"/>
-                <w:lang w:val="pt-BR"/>
-              </w:rPr>
-              <w:t>tạm</w:t>
-            </w:r>
-            <w:r>
-              <w:rPr>
-                <w:rFonts w:ascii="Times New Roman" w:hAnsi="Times New Roman"/>
-                <w:lang w:val="pt-BR"/>
-              </w:rPr>
-              <w:t xml:space="preserve"> trú/thường trú tại </w:t>
-            </w:r>
-            <w:r>
-              <w:rPr>
-                <w:rFonts w:ascii="Times New Roman" w:hAnsi="Times New Roman"/>
-                <w:lang w:val="pt-BR"/>
-              </w:rPr>
-              <w:t>V</w:t>
-            </w:r>
-            <w:r>
-              <w:rPr>
-                <w:rFonts w:ascii="Times New Roman" w:hAnsi="Times New Roman"/>
-                <w:lang w:val="pt-BR"/>
-              </w:rPr>
-              <w:t>N:</w:t>
-            </w:r>
-            <w:r>
-              <w:rPr>
-                <w:rFonts w:ascii="Times New Roman" w:hAnsi="Times New Roman"/>
-                <w:lang w:val="pt-BR"/>
-              </w:rPr>
-              <w:t xml:space="preserve"> [DC.TL]</w:t>
-            </w:r>
-          </w:p>
-          <w:p>
-            <w:pPr>
-              <w:pStyle w:val="ListParagraph"/>
-              <w:spacing w:before="40" w:beforeAutospacing="0" w:after="40" w:afterAutospacing="0"/>
-              <w:ind w:left="0"/>
-              <w:contextualSpacing w:val="0"/>
-              <w:rPr>
-                <w:rFonts w:ascii="Times New Roman" w:hAnsi="Times New Roman"/>
-                <w:lang w:val="pt-BR"/>
-              </w:rPr>
-            </w:pPr>
-            <w:r>
-              <w:rPr>
-                <w:rFonts w:ascii="Times New Roman" w:hAnsi="Times New Roman"/>
-                <w:lang w:val="pt-BR"/>
-              </w:rPr>
-              <w:t>Nơi ở hiện tại</w:t>
-            </w:r>
-            <w:r>
-              <w:rPr>
-                <w:rFonts w:ascii="Times New Roman" w:hAnsi="Times New Roman"/>
-                <w:lang w:val="pt-BR"/>
-              </w:rPr>
-              <w:t xml:space="preserve">: </w:t>
-            </w:r>
-            <w:r>
-              <w:rPr>
-                <w:rFonts w:ascii="Times New Roman" w:hAnsi="Times New Roman"/>
-                <w:lang w:val="pt-BR"/>
-              </w:rPr>
-              <w:t>[DC.TL]</w:t>
-            </w:r>
-            <w:r>
-              <w:rPr>
-                <w:rFonts w:ascii="Times New Roman" w:hAnsi="Times New Roman"/>
-                <w:lang w:val="pt-BR"/>
-              </w:rPr>
-              <w:t>.</w:t>
-            </w:r>
-            <w:r>
-              <w:rPr>
-                <w:rFonts w:ascii="Times New Roman" w:hAnsi="Times New Roman"/>
-                <w:lang w:val="pt-BR"/>
-              </w:rPr>
-              <w:t>Số điện thoại:</w:t>
-            </w:r>
-            <w:r>
-              <w:rPr>
-                <w:rFonts w:ascii="Times New Roman" w:hAnsi="Times New Roman"/>
-                <w:lang w:val="pt-BR"/>
-              </w:rPr>
-              <w:t xml:space="preserve"> [SoDT.TL]</w:t>
-            </w:r>
-          </w:p>
-          <w:p>
-            <w:pPr>
-              <w:pStyle w:val="ListParagraph"/>
-              <w:spacing w:before="40" w:beforeAutospacing="0" w:after="40" w:afterAutospacing="0"/>
-              <w:ind w:left="0"/>
-              <w:contextualSpacing w:val="0"/>
-              <w:rPr>
-                <w:rFonts w:ascii="Times New Roman" w:hAnsi="Times New Roman"/>
-                <w:lang w:val="pt-BR"/>
-              </w:rPr>
-            </w:pPr>
-            <w:r>
-              <w:rPr>
-                <w:rFonts w:ascii="Times New Roman" w:hAnsi="Times New Roman"/>
-                <w:lang w:val="pt-BR"/>
-              </w:rPr>
-              <w:t>Địa chỉ cư trú ở nước ngoài:.…………..........</w:t>
-            </w:r>
-            <w:r>
-              <w:rPr>
-                <w:rFonts w:ascii="Times New Roman" w:hAnsi="Times New Roman"/>
-                <w:lang w:val="pt-BR"/>
-              </w:rPr>
-              <w:t>....</w:t>
-            </w:r>
-            <w:r>
-              <w:rPr>
-                <w:rFonts w:ascii="Times New Roman" w:hAnsi="Times New Roman"/>
-                <w:lang w:val="pt-BR"/>
-              </w:rPr>
-              <w:t>....</w:t>
-            </w:r>
-            <w:r>
-              <w:rPr>
-                <w:rFonts w:ascii="Times New Roman" w:hAnsi="Times New Roman"/>
-                <w:lang w:val="pt-BR"/>
-              </w:rPr>
-              <w:t>......................</w:t>
-            </w:r>
-            <w:r>
-              <w:rPr>
-                <w:rFonts w:ascii="Times New Roman" w:hAnsi="Times New Roman"/>
-                <w:lang w:val="pt-BR"/>
-              </w:rPr>
-              <w:t>:........…......................</w:t>
-            </w:r>
-            <w:r>
-              <w:rPr>
-                <w:rFonts w:ascii="Times New Roman" w:hAnsi="Times New Roman"/>
-                <w:lang w:val="pt-BR"/>
-              </w:rPr>
-              <w:t>.................</w:t>
+              <w:t>Địa chỉ cư trú ở nước ngoài:.…………</w:t>
+            </w:r>
+            <w:r>
+              <w:rPr>
+                <w:rFonts w:ascii="Times New Roman" w:hAnsi="Times New Roman"/>
+                <w:lang w:val="pt-BR"/>
+              </w:rPr>
+              <w:t>.........................</w:t>
+            </w:r>
+            <w:r>
+              <w:rPr>
+                <w:rFonts w:ascii="Times New Roman" w:hAnsi="Times New Roman"/>
+                <w:lang w:val="pt-BR"/>
+              </w:rPr>
+              <w:t>...........................................................</w:t>
             </w:r>
           </w:p>
         </w:tc>
@@ -10560,7 +10040,6 @@
                 <w:rFonts w:ascii="Times New Roman" w:hAnsi="Times New Roman"/>
                 <w:lang w:val="pt-BR"/>
               </w:rPr>
-              <w:lastRenderedPageBreak/>
               <w:t xml:space="preserve">Giấy tờ tùy thân: </w:t>
             </w:r>
             <w:sdt>
@@ -10905,6 +10384,7 @@
                 <w:rFonts w:ascii="Times New Roman" w:hAnsi="Times New Roman"/>
                 <w:lang w:val="pt-BR"/>
               </w:rPr>
+              <w:lastRenderedPageBreak/>
               <w:t xml:space="preserve">Địa chỉ đăng ký </w:t>
             </w:r>
             <w:r>
@@ -13358,7 +12838,6 @@
                 <w:szCs w:val="21"/>
                 <w:lang w:val="pt-BR"/>
               </w:rPr>
-              <w:lastRenderedPageBreak/>
               <w:t>Quý khách vui lòng đánh dấu vào ô tương ứng với thông tin của tổ chức:</w:t>
             </w:r>
           </w:p>
@@ -13516,6 +12995,7 @@
                 <w:szCs w:val="21"/>
                 <w:lang w:val="pt-BR"/>
               </w:rPr>
+              <w:lastRenderedPageBreak/>
               <w:t> Tổ chức là trung gian/quỹ đầu tư ngoài nước Mỹ (</w:t>
             </w:r>
             <w:r>
@@ -14781,7 +14261,7 @@
                 <w:rFonts w:ascii="Times New Roman" w:hAnsi="Times New Roman"/>
                 <w:lang w:val="pt-BR"/>
               </w:rPr>
-              <w:t>[LTT]</w:t>
+              <w:t xml:space="preserve"> VNĐ</w:t>
             </w:r>
             <w:r>
               <w:rPr>
@@ -15378,7 +14858,6 @@
                 <w:rFonts w:ascii="Times New Roman" w:hAnsi="Times New Roman" w:cs="Times New Roman"/>
                 <w:lang w:val="pt-BR"/>
               </w:rPr>
-              <w:lastRenderedPageBreak/>
               <w:t>[Diadanh], [Ngaydaydu]</w:t>
             </w:r>
           </w:p>
@@ -15492,6 +14971,25 @@
               </w:rPr>
             </w:pPr>
           </w:p>
+          <w:p>
+            <w:pPr>
+              <w:spacing w:before="80" w:after="0" w:line="240" w:lineRule="auto"/>
+              <w:jc w:val="center"/>
+              <w:rPr>
+                <w:rFonts w:ascii="Times New Roman" w:eastAsia="Calibri" w:hAnsi="Times New Roman" w:cs="Times New Roman"/>
+                <w:lang w:val="pt-BR"/>
+              </w:rPr>
+            </w:pPr>
+          </w:p>
+          <w:p>
+            <w:pPr>
+              <w:spacing w:before="80" w:after="0" w:line="240" w:lineRule="auto"/>
+              <w:rPr>
+                <w:rFonts w:ascii="Times New Roman" w:eastAsia="Calibri" w:hAnsi="Times New Roman" w:cs="Times New Roman"/>
+                <w:lang w:val="pt-BR"/>
+              </w:rPr>
+            </w:pPr>
+          </w:p>
         </w:tc>
         <w:tc>
           <w:tcPr>
@@ -15557,132 +15055,6 @@
               </w:rPr>
               <w:t>)</w:t>
             </w:r>
-          </w:p>
-          <w:p>
-            <w:pPr>
-              <w:pStyle w:val="ListParagraph"/>
-              <w:spacing w:before="80" w:beforeAutospacing="0" w:after="0" w:afterAutospacing="0"/>
-              <w:ind w:left="0"/>
-              <w:rPr>
-                <w:rFonts w:ascii="Times New Roman" w:eastAsia="Arial Unicode MS" w:hAnsi="Times New Roman"/>
-                <w:i/>
-                <w:sz w:val="16"/>
-                <w:szCs w:val="16"/>
-                <w:lang w:val="pt-BR"/>
-              </w:rPr>
-            </w:pPr>
-          </w:p>
-          <w:p>
-            <w:pPr>
-              <w:pStyle w:val="ListParagraph"/>
-              <w:spacing w:before="80" w:beforeAutospacing="0" w:after="0" w:afterAutospacing="0"/>
-              <w:ind w:left="0"/>
-              <w:rPr>
-                <w:rFonts w:ascii="Times New Roman" w:eastAsia="Arial Unicode MS" w:hAnsi="Times New Roman"/>
-                <w:i/>
-                <w:sz w:val="16"/>
-                <w:szCs w:val="16"/>
-                <w:lang w:val="pt-BR"/>
-              </w:rPr>
-            </w:pPr>
-          </w:p>
-          <w:p>
-            <w:pPr>
-              <w:pStyle w:val="ListParagraph"/>
-              <w:spacing w:before="80" w:beforeAutospacing="0" w:after="0" w:afterAutospacing="0"/>
-              <w:ind w:left="0"/>
-              <w:rPr>
-                <w:rFonts w:ascii="Times New Roman" w:eastAsia="Arial Unicode MS" w:hAnsi="Times New Roman"/>
-                <w:i/>
-                <w:sz w:val="16"/>
-                <w:szCs w:val="16"/>
-                <w:lang w:val="pt-BR"/>
-              </w:rPr>
-            </w:pPr>
-          </w:p>
-          <w:p>
-            <w:pPr>
-              <w:pStyle w:val="ListParagraph"/>
-              <w:spacing w:before="80" w:beforeAutospacing="0" w:after="0" w:afterAutospacing="0"/>
-              <w:ind w:left="0"/>
-              <w:rPr>
-                <w:rFonts w:ascii="Times New Roman" w:eastAsia="Arial Unicode MS" w:hAnsi="Times New Roman"/>
-                <w:i/>
-                <w:sz w:val="16"/>
-                <w:szCs w:val="16"/>
-                <w:lang w:val="pt-BR"/>
-              </w:rPr>
-            </w:pPr>
-          </w:p>
-          <w:p>
-            <w:pPr>
-              <w:pStyle w:val="ListParagraph"/>
-              <w:spacing w:before="80" w:beforeAutospacing="0" w:after="0" w:afterAutospacing="0"/>
-              <w:ind w:left="0"/>
-              <w:rPr>
-                <w:rFonts w:ascii="Times New Roman" w:eastAsia="Arial Unicode MS" w:hAnsi="Times New Roman"/>
-                <w:i/>
-                <w:sz w:val="16"/>
-                <w:szCs w:val="16"/>
-                <w:lang w:val="pt-BR"/>
-              </w:rPr>
-            </w:pPr>
-          </w:p>
-          <w:p>
-            <w:pPr>
-              <w:pStyle w:val="ListParagraph"/>
-              <w:spacing w:before="80" w:beforeAutospacing="0" w:after="0" w:afterAutospacing="0"/>
-              <w:ind w:left="0"/>
-              <w:rPr>
-                <w:rFonts w:ascii="Times New Roman" w:eastAsia="Arial Unicode MS" w:hAnsi="Times New Roman"/>
-                <w:i/>
-                <w:sz w:val="16"/>
-                <w:szCs w:val="16"/>
-                <w:lang w:val="pt-BR"/>
-              </w:rPr>
-            </w:pPr>
-          </w:p>
-          <w:p>
-            <w:pPr>
-              <w:pStyle w:val="ListParagraph"/>
-              <w:spacing w:before="80" w:beforeAutospacing="0" w:after="0" w:afterAutospacing="0"/>
-              <w:ind w:left="0"/>
-              <w:rPr>
-                <w:rFonts w:ascii="Times New Roman" w:eastAsia="Arial Unicode MS" w:hAnsi="Times New Roman"/>
-                <w:i/>
-                <w:sz w:val="16"/>
-                <w:szCs w:val="16"/>
-                <w:lang w:val="pt-BR"/>
-              </w:rPr>
-            </w:pPr>
-          </w:p>
-          <w:p>
-            <w:pPr>
-              <w:pStyle w:val="ListParagraph"/>
-              <w:spacing w:before="80" w:beforeAutospacing="0" w:after="0" w:afterAutospacing="0"/>
-              <w:ind w:left="0"/>
-              <w:rPr>
-                <w:rFonts w:ascii="Times New Roman" w:eastAsia="Arial Unicode MS" w:hAnsi="Times New Roman"/>
-                <w:i/>
-                <w:sz w:val="16"/>
-                <w:szCs w:val="16"/>
-                <w:lang w:val="pt-BR"/>
-              </w:rPr>
-            </w:pPr>
-          </w:p>
-          <w:p>
-            <w:pPr>
-              <w:pStyle w:val="ListParagraph"/>
-              <w:spacing w:before="80" w:beforeAutospacing="0" w:after="0" w:afterAutospacing="0"/>
-              <w:ind w:left="0"/>
-              <w:rPr>
-                <w:rFonts w:ascii="Times New Roman" w:eastAsia="Arial Unicode MS" w:hAnsi="Times New Roman"/>
-                <w:i/>
-                <w:sz w:val="16"/>
-                <w:szCs w:val="16"/>
-                <w:lang w:val="pt-BR"/>
-              </w:rPr>
-            </w:pPr>
           </w:p>
           <w:p>
             <w:pPr>
@@ -16896,6 +16268,7 @@
   <w:style w:type="paragraph" w:default="1" w:styleId="Normal">
     <w:name w:val="Normal"/>
     <w:qFormat/>
+    <w:rsid w:val="000506C5"/>
   </w:style>
   <w:style w:type="character" w:default="1" w:styleId="DefaultParagraphFont">
     <w:name w:val="Default Paragraph Font"/>

</xml_diff>